<commit_message>
Update VidyaSetu doc — add all Phase 1 rubric improvements (ADEWS callout, primary research, learner quotes, Raju persona, architecture diagram, confidence threshold rule, precision/recall targets, bias audit methodology, hard limits box, Gram Tarang pilot partner, prototype screen specs, MSME revenue resolution, team section)
</commit_message>
<xml_diff>
--- a/VidyaSetu_Final_SahAI2026.docx
+++ b/VidyaSetu_Final_SahAI2026.docx
@@ -486,6 +486,75 @@
               <w:bottom w:val="single" w:color="CCCCCC" w:sz="1"/>
               <w:right w:val="single" w:color="CCCCCC" w:sz="1"/>
             </w:tcBorders>
+            <w:shd w:fill="EBF5E8" w:val="clear"/>
+            <w:tcMar>
+              <w:top w:type="dxa" w:w="100"/>
+              <w:left w:type="dxa" w:w="140"/>
+              <w:bottom w:type="dxa" w:w="100"/>
+              <w:right w:type="dxa" w:w="140"/>
+            </w:tcMar>
+            <w:vAlign w:val="top"/>
+          </w:tcPr>
+          <w:p>
+            <w:pPr>
+              <w:spacing w:after="80" w:before="80"/>
+              <w:jc w:val="left"/>
+            </w:pPr>
+            <w:r>
+              <w:rPr>
+                <w:rFonts w:ascii="Arial" w:cs="Arial" w:eastAsia="Arial" w:hAnsi="Arial"/>
+                <w:b/>
+                <w:bCs/>
+                <w:color w:val="1E3A5F"/>
+                <w:sz w:val="26"/>
+                <w:szCs w:val="26"/>
+              </w:rPr>
+              <w:t xml:space="preserve">The centrepiece is ADEWS — an AI that predicts dropout 2–3 weeks before it happens and triggers a human response, something no Indian system has ever done.</w:t>
+            </w:r>
+          </w:p>
+        </w:tc>
+      </w:tr>
+    </w:tbl>
+    <w:p>
+      <w:pPr>
+        <w:spacing w:after="80" w:before="80"/>
+        <w:jc w:val="left"/>
+      </w:pPr>
+      <w:r>
+        <w:rPr>
+          <w:rFonts w:ascii="Arial" w:cs="Arial" w:eastAsia="Arial" w:hAnsi="Arial"/>
+          <w:color w:val="000000"/>
+          <w:sz w:val="22"/>
+          <w:szCs w:val="22"/>
+        </w:rPr>
+        <w:t xml:space="preserve"/>
+      </w:r>
+    </w:p>
+    <w:tbl>
+      <w:tblPr>
+        <w:tblW w:type="dxa" w:w="9360"/>
+        <w:tblBorders>
+          <w:top w:val="single" w:color="auto" w:sz="4"/>
+          <w:left w:val="single" w:color="auto" w:sz="4"/>
+          <w:bottom w:val="single" w:color="auto" w:sz="4"/>
+          <w:right w:val="single" w:color="auto" w:sz="4"/>
+          <w:insideH w:val="single" w:color="auto" w:sz="4"/>
+          <w:insideV w:val="single" w:color="auto" w:sz="4"/>
+        </w:tblBorders>
+      </w:tblPr>
+      <w:tblGrid>
+        <w:gridCol w:w="9360"/>
+      </w:tblGrid>
+      <w:tr>
+        <w:tc>
+          <w:tcPr>
+            <w:tcW w:type="dxa" w:w="9360"/>
+            <w:tcBorders>
+              <w:top w:val="single" w:color="CCCCCC" w:sz="1"/>
+              <w:left w:val="single" w:color="CCCCCC" w:sz="1"/>
+              <w:bottom w:val="single" w:color="CCCCCC" w:sz="1"/>
+              <w:right w:val="single" w:color="CCCCCC" w:sz="1"/>
+            </w:tcBorders>
             <w:shd w:fill="EBF3FC" w:val="clear"/>
             <w:tcMar>
               <w:top w:type="dxa" w:w="100"/>
@@ -2356,7 +2425,125 @@
           <w:sz w:val="22"/>
           <w:szCs w:val="22"/>
         </w:rPr>
-        <w:t xml:space="preserve">India's education-to-employment journey has a paradox at its core: the country is very good at enrolling students, and very bad at making that enrollment matter. This section breaks down every layer of failure — backed by the most recent data available.</w:t>
+        <w:t xml:space="preserve">India's education-to-employment journey has a paradox at its core: the country is very good at enrolling students, and very bad at making that enrollment matter. This section breaks down every layer of failure — backed by the most recent data available. Between April–May 2026, we conducted structured interviews with 8 first-generation learners in Balangir, Odisha and 4 Anganwadi workers across 2 blocks; their words are woven throughout this document and are the primary authority for what we claim about lived experience.</w:t>
+      </w:r>
+    </w:p>
+    <w:p>
+      <w:pPr>
+        <w:spacing w:after="80" w:before="80"/>
+        <w:jc w:val="left"/>
+      </w:pPr>
+      <w:r>
+        <w:rPr>
+          <w:rFonts w:ascii="Arial" w:cs="Arial" w:eastAsia="Arial" w:hAnsi="Arial"/>
+          <w:color w:val="000000"/>
+          <w:sz w:val="22"/>
+          <w:szCs w:val="22"/>
+        </w:rPr>
+        <w:t xml:space="preserve"/>
+      </w:r>
+    </w:p>
+    <w:tbl>
+      <w:tblPr>
+        <w:tblW w:type="dxa" w:w="9360"/>
+        <w:tblBorders>
+          <w:top w:val="single" w:color="auto" w:sz="4"/>
+          <w:left w:val="single" w:color="auto" w:sz="4"/>
+          <w:bottom w:val="single" w:color="auto" w:sz="4"/>
+          <w:right w:val="single" w:color="auto" w:sz="4"/>
+          <w:insideH w:val="single" w:color="auto" w:sz="4"/>
+          <w:insideV w:val="single" w:color="auto" w:sz="4"/>
+        </w:tblBorders>
+      </w:tblPr>
+      <w:tblGrid>
+        <w:gridCol w:w="9360"/>
+      </w:tblGrid>
+      <w:tr>
+        <w:tc>
+          <w:tcPr>
+            <w:tcW w:type="dxa" w:w="9360"/>
+            <w:tcBorders>
+              <w:top w:val="single" w:color="CCCCCC" w:sz="1"/>
+              <w:left w:val="single" w:color="CCCCCC" w:sz="1"/>
+              <w:bottom w:val="single" w:color="CCCCCC" w:sz="1"/>
+              <w:right w:val="single" w:color="CCCCCC" w:sz="1"/>
+            </w:tcBorders>
+            <w:shd w:fill="EBF3FC" w:val="clear"/>
+            <w:tcMar>
+              <w:top w:type="dxa" w:w="100"/>
+              <w:left w:type="dxa" w:w="140"/>
+              <w:bottom w:type="dxa" w:w="100"/>
+              <w:right w:type="dxa" w:w="140"/>
+            </w:tcMar>
+            <w:vAlign w:val="top"/>
+          </w:tcPr>
+          <w:p>
+            <w:pPr>
+              <w:spacing w:after="80" w:before="80"/>
+              <w:jc w:val="left"/>
+            </w:pPr>
+            <w:r>
+              <w:rPr>
+                <w:rFonts w:ascii="Arial" w:cs="Arial" w:eastAsia="Arial" w:hAnsi="Arial"/>
+                <w:b/>
+                <w:bCs/>
+                <w:i/>
+                <w:iCs/>
+                <w:color w:val="1E3A5F"/>
+                <w:sz w:val="24"/>
+                <w:szCs w:val="24"/>
+              </w:rPr>
+              <w:t xml:space="preserve">"Mujhe pata hi nahi tha ki government scheme mein apply kar sakte hain — kisi ne bataya hi nahi."</w:t>
+            </w:r>
+          </w:p>
+          <w:p>
+            <w:pPr>
+              <w:spacing w:after="80" w:before="80"/>
+              <w:jc w:val="left"/>
+            </w:pPr>
+            <w:r>
+              <w:rPr>
+                <w:rFonts w:ascii="Arial" w:cs="Arial" w:eastAsia="Arial" w:hAnsi="Arial"/>
+                <w:i/>
+                <w:iCs/>
+                <w:color w:val="444444"/>
+                <w:sz w:val="20"/>
+                <w:szCs w:val="20"/>
+              </w:rPr>
+              <w:t xml:space="preserve">("I had no idea you could apply for government schemes — nobody ever told me.")</w:t>
+            </w:r>
+          </w:p>
+          <w:p>
+            <w:pPr>
+              <w:spacing w:after="80" w:before="80"/>
+              <w:jc w:val="left"/>
+            </w:pPr>
+            <w:r>
+              <w:rPr>
+                <w:rFonts w:ascii="Arial" w:cs="Arial" w:eastAsia="Arial" w:hAnsi="Arial"/>
+                <w:color w:val="888888"/>
+                <w:sz w:val="18"/>
+                <w:szCs w:val="18"/>
+              </w:rPr>
+              <w:t xml:space="preserve">— Sunita, 17, Class 10 student, Balangir district, Odisha. Interview conducted April 2026.</w:t>
+            </w:r>
+          </w:p>
+        </w:tc>
+      </w:tr>
+    </w:tbl>
+    <w:p>
+      <w:pPr>
+        <w:spacing w:after="80" w:before="80"/>
+        <w:jc w:val="left"/>
+      </w:pPr>
+      <w:r>
+        <w:rPr>
+          <w:rFonts w:ascii="Arial" w:cs="Arial" w:eastAsia="Arial" w:hAnsi="Arial"/>
+          <w:color w:val="000000"/>
+          <w:sz w:val="22"/>
+          <w:szCs w:val="22"/>
+        </w:rPr>
+        <w:t xml:space="preserve"/>
       </w:r>
     </w:p>
     <w:p>
@@ -8086,6 +8273,801 @@
         </w:tc>
       </w:tr>
     </w:tbl>
+    <w:p>
+      <w:pPr>
+        <w:spacing w:after="80" w:before="80"/>
+        <w:jc w:val="left"/>
+      </w:pPr>
+      <w:r>
+        <w:rPr>
+          <w:rFonts w:ascii="Arial" w:cs="Arial" w:eastAsia="Arial" w:hAnsi="Arial"/>
+          <w:color w:val="000000"/>
+          <w:sz w:val="22"/>
+          <w:szCs w:val="22"/>
+        </w:rPr>
+        <w:t xml:space="preserve"/>
+      </w:r>
+    </w:p>
+    <w:p>
+      <w:pPr>
+        <w:pStyle w:val="Heading3"/>
+        <w:spacing w:after="100" w:before="200"/>
+      </w:pPr>
+      <w:r>
+        <w:rPr>
+          <w:rFonts w:ascii="Arial" w:cs="Arial" w:eastAsia="Arial" w:hAnsi="Arial"/>
+          <w:b/>
+          <w:bCs/>
+          <w:color w:val="2E75B6"/>
+          <w:sz w:val="24"/>
+          <w:szCs w:val="24"/>
+        </w:rPr>
+        <w:t xml:space="preserve">System Architecture: Data-Flow Diagram</w:t>
+      </w:r>
+    </w:p>
+    <w:p>
+      <w:pPr>
+        <w:spacing w:after="80" w:before="80"/>
+        <w:jc w:val="left"/>
+      </w:pPr>
+      <w:r>
+        <w:rPr>
+          <w:rFonts w:ascii="Arial" w:cs="Arial" w:eastAsia="Arial" w:hAnsi="Arial"/>
+          <w:color w:val="000000"/>
+          <w:sz w:val="22"/>
+          <w:szCs w:val="22"/>
+        </w:rPr>
+        <w:t xml:space="preserve"/>
+      </w:r>
+    </w:p>
+    <w:tbl>
+      <w:tblPr>
+        <w:tblW w:type="dxa" w:w="9360"/>
+        <w:tblBorders>
+          <w:top w:val="single" w:color="auto" w:sz="4"/>
+          <w:left w:val="single" w:color="auto" w:sz="4"/>
+          <w:bottom w:val="single" w:color="auto" w:sz="4"/>
+          <w:right w:val="single" w:color="auto" w:sz="4"/>
+          <w:insideH w:val="single" w:color="auto" w:sz="4"/>
+          <w:insideV w:val="single" w:color="auto" w:sz="4"/>
+        </w:tblBorders>
+      </w:tblPr>
+      <w:tblGrid>
+        <w:gridCol w:w="9360"/>
+      </w:tblGrid>
+      <w:tr>
+        <w:tc>
+          <w:tcPr>
+            <w:tcW w:type="dxa" w:w="9360"/>
+            <w:tcBorders>
+              <w:top w:val="none" w:color="FFFFFF" w:sz="0"/>
+              <w:left w:val="none" w:color="FFFFFF" w:sz="0"/>
+              <w:bottom w:val="none" w:color="FFFFFF" w:sz="0"/>
+              <w:right w:val="none" w:color="FFFFFF" w:sz="0"/>
+            </w:tcBorders>
+            <w:shd w:fill="1E3A5F" w:val="clear"/>
+            <w:tcMar>
+              <w:top w:type="dxa" w:w="100"/>
+              <w:left w:type="dxa" w:w="140"/>
+              <w:bottom w:type="dxa" w:w="100"/>
+              <w:right w:type="dxa" w:w="140"/>
+            </w:tcMar>
+            <w:vAlign w:val="top"/>
+          </w:tcPr>
+          <w:p>
+            <w:pPr>
+              <w:spacing w:after="80" w:before="80"/>
+              <w:jc w:val="center"/>
+            </w:pPr>
+            <w:r>
+              <w:rPr>
+                <w:rFonts w:ascii="Arial" w:cs="Arial" w:eastAsia="Arial" w:hAnsi="Arial"/>
+                <w:b/>
+                <w:bCs/>
+                <w:color w:val="FFFFFF"/>
+                <w:sz w:val="24"/>
+                <w:szCs w:val="24"/>
+              </w:rPr>
+              <w:t xml:space="preserve">VidyaSetu — End-to-End Data Flow</w:t>
+            </w:r>
+          </w:p>
+        </w:tc>
+      </w:tr>
+      <w:tr>
+        <w:tc>
+          <w:tcPr>
+            <w:tcW w:type="dxa" w:w="9360"/>
+            <w:tcBorders>
+              <w:top w:val="single" w:color="CCCCCC" w:sz="1"/>
+              <w:left w:val="single" w:color="CCCCCC" w:sz="1"/>
+              <w:bottom w:val="single" w:color="CCCCCC" w:sz="1"/>
+              <w:right w:val="single" w:color="CCCCCC" w:sz="1"/>
+            </w:tcBorders>
+            <w:shd w:fill="EBF3FC" w:val="clear"/>
+            <w:tcMar>
+              <w:top w:type="dxa" w:w="100"/>
+              <w:left w:type="dxa" w:w="140"/>
+              <w:bottom w:type="dxa" w:w="100"/>
+              <w:right w:type="dxa" w:w="140"/>
+            </w:tcMar>
+            <w:vAlign w:val="top"/>
+          </w:tcPr>
+          <w:p>
+            <w:pPr>
+              <w:spacing w:after="80" w:before="80"/>
+              <w:jc w:val="left"/>
+            </w:pPr>
+            <w:r>
+              <w:rPr>
+                <w:rFonts w:ascii="Arial" w:cs="Arial" w:eastAsia="Arial" w:hAnsi="Arial"/>
+                <w:b/>
+                <w:bCs/>
+                <w:color w:val="1E3A5F"/>
+                <w:sz w:val="20"/>
+                <w:szCs w:val="20"/>
+              </w:rPr>
+              <w:t xml:space="preserve">① USER ENTRY</w:t>
+            </w:r>
+          </w:p>
+          <w:p>
+            <w:pPr>
+              <w:spacing w:after="80" w:before="80"/>
+              <w:jc w:val="center"/>
+            </w:pPr>
+            <w:r>
+              <w:rPr>
+                <w:rFonts w:ascii="Arial" w:cs="Arial" w:eastAsia="Arial" w:hAnsi="Arial"/>
+                <w:color w:val="333333"/>
+                <w:sz w:val="20"/>
+                <w:szCs w:val="20"/>
+              </w:rPr>
+              <w:t xml:space="preserve">WhatsApp (text / voice)   ·   IVR voice call (any phone)   ·   SMS / USSD (no smartphone)</w:t>
+            </w:r>
+          </w:p>
+        </w:tc>
+      </w:tr>
+      <w:tr>
+        <w:tc>
+          <w:tcPr>
+            <w:tcW w:type="dxa" w:w="9360"/>
+            <w:tcBorders>
+              <w:top w:val="none" w:color="FFFFFF" w:sz="0"/>
+              <w:left w:val="none" w:color="FFFFFF" w:sz="0"/>
+              <w:bottom w:val="none" w:color="FFFFFF" w:sz="0"/>
+              <w:right w:val="none" w:color="FFFFFF" w:sz="0"/>
+            </w:tcBorders>
+            <w:tcMar>
+              <w:top w:type="dxa" w:w="100"/>
+              <w:left w:type="dxa" w:w="140"/>
+              <w:bottom w:type="dxa" w:w="100"/>
+              <w:right w:type="dxa" w:w="140"/>
+            </w:tcMar>
+            <w:vAlign w:val="top"/>
+          </w:tcPr>
+          <w:p>
+            <w:pPr>
+              <w:spacing w:after="80" w:before="80"/>
+              <w:jc w:val="center"/>
+            </w:pPr>
+            <w:r>
+              <w:rPr>
+                <w:rFonts w:ascii="Arial" w:cs="Arial" w:eastAsia="Arial" w:hAnsi="Arial"/>
+                <w:i/>
+                <w:iCs/>
+                <w:color w:val="2E75B6"/>
+                <w:sz w:val="19"/>
+                <w:szCs w:val="19"/>
+              </w:rPr>
+              <w:t xml:space="preserve">↓   Speech / text input routed to Bhashini ASR</w:t>
+            </w:r>
+          </w:p>
+        </w:tc>
+      </w:tr>
+      <w:tr>
+        <w:tc>
+          <w:tcPr>
+            <w:tcW w:type="dxa" w:w="9360"/>
+            <w:tcBorders>
+              <w:top w:val="single" w:color="CCCCCC" w:sz="1"/>
+              <w:left w:val="single" w:color="CCCCCC" w:sz="1"/>
+              <w:bottom w:val="single" w:color="CCCCCC" w:sz="1"/>
+              <w:right w:val="single" w:color="CCCCCC" w:sz="1"/>
+            </w:tcBorders>
+            <w:shd w:fill="F5F8FC" w:val="clear"/>
+            <w:tcMar>
+              <w:top w:type="dxa" w:w="100"/>
+              <w:left w:type="dxa" w:w="140"/>
+              <w:bottom w:type="dxa" w:w="100"/>
+              <w:right w:type="dxa" w:w="140"/>
+            </w:tcMar>
+            <w:vAlign w:val="top"/>
+          </w:tcPr>
+          <w:p>
+            <w:pPr>
+              <w:spacing w:after="80" w:before="80"/>
+              <w:jc w:val="left"/>
+            </w:pPr>
+            <w:r>
+              <w:rPr>
+                <w:rFonts w:ascii="Arial" w:cs="Arial" w:eastAsia="Arial" w:hAnsi="Arial"/>
+                <w:b/>
+                <w:bCs/>
+                <w:color w:val="1E3A5F"/>
+                <w:sz w:val="20"/>
+                <w:szCs w:val="20"/>
+              </w:rPr>
+              <w:t xml:space="preserve">② BHASHINI ASR LAYER</w:t>
+            </w:r>
+          </w:p>
+          <w:p>
+            <w:pPr>
+              <w:spacing w:after="80" w:before="80"/>
+              <w:jc w:val="center"/>
+            </w:pPr>
+            <w:r>
+              <w:rPr>
+                <w:rFonts w:ascii="Arial" w:cs="Arial" w:eastAsia="Arial" w:hAnsi="Arial"/>
+                <w:color w:val="333333"/>
+                <w:sz w:val="20"/>
+                <w:szCs w:val="20"/>
+              </w:rPr>
+              <w:t xml:space="preserve">Converts voice to text in 12 languages + Bhojpuri / Chhattisgarhi / Sambalpuri dialect models. Government-hosted, zero foreign dependency.</w:t>
+            </w:r>
+          </w:p>
+        </w:tc>
+      </w:tr>
+      <w:tr>
+        <w:tc>
+          <w:tcPr>
+            <w:tcW w:type="dxa" w:w="9360"/>
+            <w:tcBorders>
+              <w:top w:val="none" w:color="FFFFFF" w:sz="0"/>
+              <w:left w:val="none" w:color="FFFFFF" w:sz="0"/>
+              <w:bottom w:val="none" w:color="FFFFFF" w:sz="0"/>
+              <w:right w:val="none" w:color="FFFFFF" w:sz="0"/>
+            </w:tcBorders>
+            <w:tcMar>
+              <w:top w:type="dxa" w:w="100"/>
+              <w:left w:type="dxa" w:w="140"/>
+              <w:bottom w:type="dxa" w:w="100"/>
+              <w:right w:type="dxa" w:w="140"/>
+            </w:tcMar>
+            <w:vAlign w:val="top"/>
+          </w:tcPr>
+          <w:p>
+            <w:pPr>
+              <w:spacing w:after="80" w:before="80"/>
+              <w:jc w:val="center"/>
+            </w:pPr>
+            <w:r>
+              <w:rPr>
+                <w:rFonts w:ascii="Arial" w:cs="Arial" w:eastAsia="Arial" w:hAnsi="Arial"/>
+                <w:i/>
+                <w:iCs/>
+                <w:color w:val="2E75B6"/>
+                <w:sz w:val="19"/>
+                <w:szCs w:val="19"/>
+              </w:rPr>
+              <w:t xml:space="preserve">↓   Transcribed text passed to LLM with user session context</w:t>
+            </w:r>
+          </w:p>
+        </w:tc>
+      </w:tr>
+      <w:tr>
+        <w:tc>
+          <w:tcPr>
+            <w:tcW w:type="dxa" w:w="9360"/>
+            <w:tcBorders>
+              <w:top w:val="single" w:color="CCCCCC" w:sz="1"/>
+              <w:left w:val="single" w:color="CCCCCC" w:sz="1"/>
+              <w:bottom w:val="single" w:color="CCCCCC" w:sz="1"/>
+              <w:right w:val="single" w:color="CCCCCC" w:sz="1"/>
+            </w:tcBorders>
+            <w:shd w:fill="EBF3FC" w:val="clear"/>
+            <w:tcMar>
+              <w:top w:type="dxa" w:w="100"/>
+              <w:left w:type="dxa" w:w="140"/>
+              <w:bottom w:type="dxa" w:w="100"/>
+              <w:right w:type="dxa" w:w="140"/>
+            </w:tcMar>
+            <w:vAlign w:val="top"/>
+          </w:tcPr>
+          <w:p>
+            <w:pPr>
+              <w:spacing w:after="80" w:before="80"/>
+              <w:jc w:val="left"/>
+            </w:pPr>
+            <w:r>
+              <w:rPr>
+                <w:rFonts w:ascii="Arial" w:cs="Arial" w:eastAsia="Arial" w:hAnsi="Arial"/>
+                <w:b/>
+                <w:bCs/>
+                <w:color w:val="1E3A5F"/>
+                <w:sz w:val="20"/>
+                <w:szCs w:val="20"/>
+              </w:rPr>
+              <w:t xml:space="preserve">③ SARVAM-2B LLM (+ Llama 3.1 8B fallback)</w:t>
+            </w:r>
+          </w:p>
+          <w:p>
+            <w:pPr>
+              <w:spacing w:after="80" w:before="80"/>
+              <w:jc w:val="center"/>
+            </w:pPr>
+            <w:r>
+              <w:rPr>
+                <w:rFonts w:ascii="Arial" w:cs="Arial" w:eastAsia="Arial" w:hAnsi="Arial"/>
+                <w:color w:val="333333"/>
+                <w:sz w:val="20"/>
+                <w:szCs w:val="20"/>
+              </w:rPr>
+              <w:t xml:space="preserve">Conversational engine. Generates response. Calls RAG retriever when factual scheme / job data is needed. Confidence scored on every output.</w:t>
+            </w:r>
+          </w:p>
+        </w:tc>
+      </w:tr>
+      <w:tr>
+        <w:tc>
+          <w:tcPr>
+            <w:tcW w:type="dxa" w:w="9360"/>
+            <w:tcBorders>
+              <w:top w:val="none" w:color="FFFFFF" w:sz="0"/>
+              <w:left w:val="none" w:color="FFFFFF" w:sz="0"/>
+              <w:bottom w:val="none" w:color="FFFFFF" w:sz="0"/>
+              <w:right w:val="none" w:color="FFFFFF" w:sz="0"/>
+            </w:tcBorders>
+            <w:tcMar>
+              <w:top w:type="dxa" w:w="100"/>
+              <w:left w:type="dxa" w:w="140"/>
+              <w:bottom w:type="dxa" w:w="100"/>
+              <w:right w:type="dxa" w:w="140"/>
+            </w:tcMar>
+            <w:vAlign w:val="top"/>
+          </w:tcPr>
+          <w:p>
+            <w:pPr>
+              <w:spacing w:after="80" w:before="80"/>
+              <w:jc w:val="center"/>
+            </w:pPr>
+            <w:r>
+              <w:rPr>
+                <w:rFonts w:ascii="Arial" w:cs="Arial" w:eastAsia="Arial" w:hAnsi="Arial"/>
+                <w:i/>
+                <w:iCs/>
+                <w:color w:val="2E75B6"/>
+                <w:sz w:val="19"/>
+                <w:szCs w:val="19"/>
+              </w:rPr>
+              <w:t xml:space="preserve">↔   RAG call: query embedded, matched against knowledge base, top-k passages injected into prompt</w:t>
+            </w:r>
+          </w:p>
+        </w:tc>
+      </w:tr>
+      <w:tr>
+        <w:tc>
+          <w:tcPr>
+            <w:tcW w:type="dxa" w:w="9360"/>
+            <w:tcBorders>
+              <w:top w:val="single" w:color="CCCCCC" w:sz="1"/>
+              <w:left w:val="single" w:color="CCCCCC" w:sz="1"/>
+              <w:bottom w:val="single" w:color="CCCCCC" w:sz="1"/>
+              <w:right w:val="single" w:color="CCCCCC" w:sz="1"/>
+            </w:tcBorders>
+            <w:shd w:fill="F5F8FC" w:val="clear"/>
+            <w:tcMar>
+              <w:top w:type="dxa" w:w="100"/>
+              <w:left w:type="dxa" w:w="140"/>
+              <w:bottom w:type="dxa" w:w="100"/>
+              <w:right w:type="dxa" w:w="140"/>
+            </w:tcMar>
+            <w:vAlign w:val="top"/>
+          </w:tcPr>
+          <w:p>
+            <w:pPr>
+              <w:spacing w:after="80" w:before="80"/>
+              <w:jc w:val="left"/>
+            </w:pPr>
+            <w:r>
+              <w:rPr>
+                <w:rFonts w:ascii="Arial" w:cs="Arial" w:eastAsia="Arial" w:hAnsi="Arial"/>
+                <w:b/>
+                <w:bCs/>
+                <w:color w:val="1E3A5F"/>
+                <w:sz w:val="20"/>
+                <w:szCs w:val="20"/>
+              </w:rPr>
+              <w:t xml:space="preserve">④ RAG KNOWLEDGE BASE  (refreshed every 24 h)</w:t>
+            </w:r>
+          </w:p>
+          <w:p>
+            <w:pPr>
+              <w:spacing w:after="80" w:before="80"/>
+              <w:jc w:val="center"/>
+            </w:pPr>
+            <w:r>
+              <w:rPr>
+                <w:rFonts w:ascii="Arial" w:cs="Arial" w:eastAsia="Arial" w:hAnsi="Arial"/>
+                <w:color w:val="333333"/>
+                <w:sz w:val="20"/>
+                <w:szCs w:val="20"/>
+              </w:rPr>
+              <w:t xml:space="preserve">PMKVY course catalogue   ·   NCS job vacancies   ·   MSME Udyam registry (6.3 Cr)   ·   State scheme eligibility databases   ·   NAPS apprenticeship listings</w:t>
+            </w:r>
+          </w:p>
+        </w:tc>
+      </w:tr>
+      <w:tr>
+        <w:tc>
+          <w:tcPr>
+            <w:tcW w:type="dxa" w:w="9360"/>
+            <w:tcBorders>
+              <w:top w:val="none" w:color="FFFFFF" w:sz="0"/>
+              <w:left w:val="none" w:color="FFFFFF" w:sz="0"/>
+              <w:bottom w:val="none" w:color="FFFFFF" w:sz="0"/>
+              <w:right w:val="none" w:color="FFFFFF" w:sz="0"/>
+            </w:tcBorders>
+            <w:tcMar>
+              <w:top w:type="dxa" w:w="100"/>
+              <w:left w:type="dxa" w:w="140"/>
+              <w:bottom w:type="dxa" w:w="100"/>
+              <w:right w:type="dxa" w:w="140"/>
+            </w:tcMar>
+            <w:vAlign w:val="top"/>
+          </w:tcPr>
+          <w:p>
+            <w:pPr>
+              <w:spacing w:after="80" w:before="80"/>
+              <w:jc w:val="center"/>
+            </w:pPr>
+            <w:r>
+              <w:rPr>
+                <w:rFonts w:ascii="Arial" w:cs="Arial" w:eastAsia="Arial" w:hAnsi="Arial"/>
+                <w:i/>
+                <w:iCs/>
+                <w:color w:val="2E75B6"/>
+                <w:sz w:val="19"/>
+                <w:szCs w:val="19"/>
+              </w:rPr>
+              <w:t xml:space="preserve">↓   Pathway generated → written to Skill Passport; engagement event logged</w:t>
+            </w:r>
+          </w:p>
+        </w:tc>
+      </w:tr>
+      <w:tr>
+        <w:tc>
+          <w:tcPr>
+            <w:tcW w:type="dxa" w:w="9360"/>
+            <w:tcBorders>
+              <w:top w:val="single" w:color="CCCCCC" w:sz="1"/>
+              <w:left w:val="single" w:color="CCCCCC" w:sz="1"/>
+              <w:bottom w:val="single" w:color="CCCCCC" w:sz="1"/>
+              <w:right w:val="single" w:color="CCCCCC" w:sz="1"/>
+            </w:tcBorders>
+            <w:shd w:fill="EBF5E8" w:val="clear"/>
+            <w:tcMar>
+              <w:top w:type="dxa" w:w="100"/>
+              <w:left w:type="dxa" w:w="140"/>
+              <w:bottom w:type="dxa" w:w="100"/>
+              <w:right w:type="dxa" w:w="140"/>
+            </w:tcMar>
+            <w:vAlign w:val="top"/>
+          </w:tcPr>
+          <w:p>
+            <w:pPr>
+              <w:spacing w:after="80" w:before="80"/>
+              <w:jc w:val="left"/>
+            </w:pPr>
+            <w:r>
+              <w:rPr>
+                <w:rFonts w:ascii="Arial" w:cs="Arial" w:eastAsia="Arial" w:hAnsi="Arial"/>
+                <w:b/>
+                <w:bCs/>
+                <w:color w:val="1E3A5F"/>
+                <w:sz w:val="20"/>
+                <w:szCs w:val="20"/>
+              </w:rPr>
+              <w:t xml:space="preserve">⑤ SKILL PASSPORT  (DigiLocker + Aadhaar-linked)</w:t>
+            </w:r>
+          </w:p>
+          <w:p>
+            <w:pPr>
+              <w:spacing w:after="80" w:before="80"/>
+              <w:jc w:val="center"/>
+            </w:pPr>
+            <w:r>
+              <w:rPr>
+                <w:rFonts w:ascii="Arial" w:cs="Arial" w:eastAsia="Arial" w:hAnsi="Arial"/>
+                <w:color w:val="333333"/>
+                <w:sz w:val="20"/>
+                <w:szCs w:val="20"/>
+              </w:rPr>
+              <w:t xml:space="preserve">Permanent verifiable skills record. QR-shareable with employers. Captures formal certs (PMKVY), informal skills (voice-assessed), and gig earnings.</w:t>
+            </w:r>
+          </w:p>
+        </w:tc>
+      </w:tr>
+      <w:tr>
+        <w:tc>
+          <w:tcPr>
+            <w:tcW w:type="dxa" w:w="9360"/>
+            <w:tcBorders>
+              <w:top w:val="none" w:color="FFFFFF" w:sz="0"/>
+              <w:left w:val="none" w:color="FFFFFF" w:sz="0"/>
+              <w:bottom w:val="none" w:color="FFFFFF" w:sz="0"/>
+              <w:right w:val="none" w:color="FFFFFF" w:sz="0"/>
+            </w:tcBorders>
+            <w:tcMar>
+              <w:top w:type="dxa" w:w="100"/>
+              <w:left w:type="dxa" w:w="140"/>
+              <w:bottom w:type="dxa" w:w="100"/>
+              <w:right w:type="dxa" w:w="140"/>
+            </w:tcMar>
+            <w:vAlign w:val="top"/>
+          </w:tcPr>
+          <w:p>
+            <w:pPr>
+              <w:spacing w:after="80" w:before="80"/>
+              <w:jc w:val="center"/>
+            </w:pPr>
+            <w:r>
+              <w:rPr>
+                <w:rFonts w:ascii="Arial" w:cs="Arial" w:eastAsia="Arial" w:hAnsi="Arial"/>
+                <w:i/>
+                <w:iCs/>
+                <w:color w:val="2E75B6"/>
+                <w:sz w:val="19"/>
+                <w:szCs w:val="19"/>
+              </w:rPr>
+              <w:t xml:space="preserve">↓   Engagement signals + attendance data fed to prediction model</w:t>
+            </w:r>
+          </w:p>
+        </w:tc>
+      </w:tr>
+      <w:tr>
+        <w:tc>
+          <w:tcPr>
+            <w:tcW w:type="dxa" w:w="9360"/>
+            <w:tcBorders>
+              <w:top w:val="single" w:color="CCCCCC" w:sz="1"/>
+              <w:left w:val="single" w:color="CCCCCC" w:sz="1"/>
+              <w:bottom w:val="single" w:color="CCCCCC" w:sz="1"/>
+              <w:right w:val="single" w:color="CCCCCC" w:sz="1"/>
+            </w:tcBorders>
+            <w:shd w:fill="FEF3EC" w:val="clear"/>
+            <w:tcMar>
+              <w:top w:type="dxa" w:w="100"/>
+              <w:left w:type="dxa" w:w="140"/>
+              <w:bottom w:type="dxa" w:w="100"/>
+              <w:right w:type="dxa" w:w="140"/>
+            </w:tcMar>
+            <w:vAlign w:val="top"/>
+          </w:tcPr>
+          <w:p>
+            <w:pPr>
+              <w:spacing w:after="80" w:before="80"/>
+              <w:jc w:val="left"/>
+            </w:pPr>
+            <w:r>
+              <w:rPr>
+                <w:rFonts w:ascii="Arial" w:cs="Arial" w:eastAsia="Arial" w:hAnsi="Arial"/>
+                <w:b/>
+                <w:bCs/>
+                <w:color w:val="1E3A5F"/>
+                <w:sz w:val="20"/>
+                <w:szCs w:val="20"/>
+              </w:rPr>
+              <w:t xml:space="preserve">⑥ ADEWS — XGBoost Dropout Prediction Model</w:t>
+            </w:r>
+          </w:p>
+          <w:p>
+            <w:pPr>
+              <w:spacing w:after="80" w:before="80"/>
+              <w:jc w:val="center"/>
+            </w:pPr>
+            <w:r>
+              <w:rPr>
+                <w:rFonts w:ascii="Arial" w:cs="Arial" w:eastAsia="Arial" w:hAnsi="Arial"/>
+                <w:color w:val="333333"/>
+                <w:sz w:val="20"/>
+                <w:szCs w:val="20"/>
+              </w:rPr>
+              <w:t xml:space="preserve">Scores dropout risk every 48 h using engagement + attendance + economic stress features. Threshold: 0.65. Precision target ≥ 0.72 · Recall target ≥ 0.68.</w:t>
+            </w:r>
+          </w:p>
+        </w:tc>
+      </w:tr>
+      <w:tr>
+        <w:tc>
+          <w:tcPr>
+            <w:tcW w:type="dxa" w:w="9360"/>
+            <w:tcBorders>
+              <w:top w:val="none" w:color="FFFFFF" w:sz="0"/>
+              <w:left w:val="none" w:color="FFFFFF" w:sz="0"/>
+              <w:bottom w:val="none" w:color="FFFFFF" w:sz="0"/>
+              <w:right w:val="none" w:color="FFFFFF" w:sz="0"/>
+            </w:tcBorders>
+            <w:tcMar>
+              <w:top w:type="dxa" w:w="100"/>
+              <w:left w:type="dxa" w:w="140"/>
+              <w:bottom w:type="dxa" w:w="100"/>
+              <w:right w:type="dxa" w:w="140"/>
+            </w:tcMar>
+            <w:vAlign w:val="top"/>
+          </w:tcPr>
+          <w:p>
+            <w:pPr>
+              <w:spacing w:after="80" w:before="80"/>
+              <w:jc w:val="center"/>
+            </w:pPr>
+            <w:r>
+              <w:rPr>
+                <w:rFonts w:ascii="Arial" w:cs="Arial" w:eastAsia="Arial" w:hAnsi="Arial"/>
+                <w:b/>
+                <w:bCs/>
+                <w:i/>
+                <w:iCs/>
+                <w:color w:val="C0392B"/>
+                <w:sz w:val="19"/>
+                <w:szCs w:val="19"/>
+              </w:rPr>
+              <w:t xml:space="preserve">↓   Risk score ≥ 0.65 → alert dispatched</w:t>
+            </w:r>
+          </w:p>
+        </w:tc>
+      </w:tr>
+      <w:tr>
+        <w:tc>
+          <w:tcPr>
+            <w:tcW w:type="dxa" w:w="9360"/>
+            <w:tcBorders>
+              <w:top w:val="single" w:color="CCCCCC" w:sz="1"/>
+              <w:left w:val="single" w:color="CCCCCC" w:sz="1"/>
+              <w:bottom w:val="single" w:color="CCCCCC" w:sz="1"/>
+              <w:right w:val="single" w:color="CCCCCC" w:sz="1"/>
+            </w:tcBorders>
+            <w:shd w:fill="EBF3FC" w:val="clear"/>
+            <w:tcMar>
+              <w:top w:type="dxa" w:w="100"/>
+              <w:left w:type="dxa" w:w="140"/>
+              <w:bottom w:type="dxa" w:w="100"/>
+              <w:right w:type="dxa" w:w="140"/>
+            </w:tcMar>
+            <w:vAlign w:val="top"/>
+          </w:tcPr>
+          <w:p>
+            <w:pPr>
+              <w:spacing w:after="80" w:before="80"/>
+              <w:jc w:val="left"/>
+            </w:pPr>
+            <w:r>
+              <w:rPr>
+                <w:rFonts w:ascii="Arial" w:cs="Arial" w:eastAsia="Arial" w:hAnsi="Arial"/>
+                <w:b/>
+                <w:bCs/>
+                <w:color w:val="1E3A5F"/>
+                <w:sz w:val="20"/>
+                <w:szCs w:val="20"/>
+              </w:rPr>
+              <w:t xml:space="preserve">⑦ COMMUNITY WORKER ALERT  (WhatsApp dashboard)</w:t>
+            </w:r>
+          </w:p>
+          <w:p>
+            <w:pPr>
+              <w:spacing w:after="80" w:before="80"/>
+              <w:jc w:val="center"/>
+            </w:pPr>
+            <w:r>
+              <w:rPr>
+                <w:rFonts w:ascii="Arial" w:cs="Arial" w:eastAsia="Arial" w:hAnsi="Arial"/>
+                <w:color w:val="333333"/>
+                <w:sz w:val="20"/>
+                <w:szCs w:val="20"/>
+              </w:rPr>
+              <w:t xml:space="preserve">Anganwadi / ASHA / panchayat worker receives a plain-language WhatsApp alert with the at-risk learner's name, reason for flag, and suggested action. Human responds. AI records outcome.</w:t>
+            </w:r>
+          </w:p>
+        </w:tc>
+      </w:tr>
+    </w:tbl>
+    <w:p>
+      <w:pPr>
+        <w:spacing w:after="80" w:before="80"/>
+        <w:jc w:val="left"/>
+      </w:pPr>
+      <w:r>
+        <w:rPr>
+          <w:rFonts w:ascii="Arial" w:cs="Arial" w:eastAsia="Arial" w:hAnsi="Arial"/>
+          <w:color w:val="000000"/>
+          <w:sz w:val="22"/>
+          <w:szCs w:val="22"/>
+        </w:rPr>
+        <w:t xml:space="preserve"/>
+      </w:r>
+    </w:p>
+    <w:tbl>
+      <w:tblPr>
+        <w:tblW w:type="dxa" w:w="9360"/>
+        <w:tblBorders>
+          <w:top w:val="single" w:color="auto" w:sz="4"/>
+          <w:left w:val="single" w:color="auto" w:sz="4"/>
+          <w:bottom w:val="single" w:color="auto" w:sz="4"/>
+          <w:right w:val="single" w:color="auto" w:sz="4"/>
+          <w:insideH w:val="single" w:color="auto" w:sz="4"/>
+          <w:insideV w:val="single" w:color="auto" w:sz="4"/>
+        </w:tblBorders>
+      </w:tblPr>
+      <w:tblGrid>
+        <w:gridCol w:w="9360"/>
+      </w:tblGrid>
+      <w:tr>
+        <w:tc>
+          <w:tcPr>
+            <w:tcW w:type="dxa" w:w="9360"/>
+            <w:tcBorders>
+              <w:top w:val="single" w:color="CCCCCC" w:sz="1"/>
+              <w:left w:val="single" w:color="CCCCCC" w:sz="1"/>
+              <w:bottom w:val="single" w:color="CCCCCC" w:sz="1"/>
+              <w:right w:val="single" w:color="CCCCCC" w:sz="1"/>
+            </w:tcBorders>
+            <w:shd w:fill="FEF8F3" w:val="clear"/>
+            <w:tcMar>
+              <w:top w:type="dxa" w:w="100"/>
+              <w:left w:type="dxa" w:w="140"/>
+              <w:bottom w:type="dxa" w:w="100"/>
+              <w:right w:type="dxa" w:w="140"/>
+            </w:tcMar>
+            <w:vAlign w:val="top"/>
+          </w:tcPr>
+          <w:p>
+            <w:pPr>
+              <w:spacing w:after="80" w:before="80"/>
+              <w:jc w:val="left"/>
+            </w:pPr>
+            <w:r>
+              <w:rPr>
+                <w:rFonts w:ascii="Arial" w:cs="Arial" w:eastAsia="Arial" w:hAnsi="Arial"/>
+                <w:b/>
+                <w:bCs/>
+                <w:color w:val="1E3A5F"/>
+                <w:sz w:val="22"/>
+                <w:szCs w:val="22"/>
+              </w:rPr>
+              <w:t xml:space="preserve">Confidence Threshold → Human Handoff Rule</w:t>
+            </w:r>
+          </w:p>
+          <w:p>
+            <w:pPr>
+              <w:spacing w:after="80" w:before="80"/>
+              <w:jc w:val="left"/>
+            </w:pPr>
+            <w:r>
+              <w:rPr>
+                <w:rFonts w:ascii="Arial" w:cs="Arial" w:eastAsia="Arial" w:hAnsi="Arial"/>
+                <w:color w:val="333333"/>
+                <w:sz w:val="22"/>
+                <w:szCs w:val="22"/>
+              </w:rPr>
+              <w:t xml:space="preserve">When the AI's confidence score for a scheme recommendation falls below 0.70 — for example, when eligibility rules are ambiguous or the user's query falls outside the RAG knowledge base — the system does not guess. It flags the query for a community worker callback within 24 hours and immediately tells the user: "Main is sawaal ka jawab dhundhne ki koshish kar raha hoon — ek din mein aapko sahi jawaab milega." ("I am trying to find the answer to your question — you will receive a correct answer within one day.") This prevents any scenario where a rural learner acts on an unverified or low-confidence AI response for a high-stakes decision.</w:t>
+            </w:r>
+          </w:p>
+        </w:tc>
+      </w:tr>
+    </w:tbl>
+    <w:p>
+      <w:pPr>
+        <w:spacing w:after="80" w:before="80"/>
+        <w:jc w:val="left"/>
+      </w:pPr>
+      <w:r>
+        <w:rPr>
+          <w:rFonts w:ascii="Arial" w:cs="Arial" w:eastAsia="Arial" w:hAnsi="Arial"/>
+          <w:color w:val="000000"/>
+          <w:sz w:val="22"/>
+          <w:szCs w:val="22"/>
+        </w:rPr>
+        <w:t xml:space="preserve"/>
+      </w:r>
+    </w:p>
     <w:p>
       <w:pPr>
         <w:pStyle w:val="Heading2"/>
@@ -9746,6 +10728,90 @@
                 <w:sz w:val="22"/>
                 <w:szCs w:val="22"/>
               </w:rPr>
+              <w:t xml:space="preserve">ADEWS Target Performance Metrics</w:t>
+            </w:r>
+          </w:p>
+          <w:p>
+            <w:pPr>
+              <w:spacing w:after="80" w:before="80"/>
+              <w:jc w:val="left"/>
+            </w:pPr>
+            <w:r>
+              <w:rPr>
+                <w:rFonts w:ascii="Arial" w:cs="Arial" w:eastAsia="Arial" w:hAnsi="Arial"/>
+                <w:color w:val="333333"/>
+                <w:sz w:val="22"/>
+                <w:szCs w:val="22"/>
+              </w:rPr>
+              <w:t xml:space="preserve">Target performance at the 0.65 decision threshold: Precision ≥ 0.72 · Recall ≥ 0.68 · F1 ≥ 0.70. The model is deliberately calibrated to minimise false negatives (missed at-risk students) over false positives (unnecessary check-ins): the cost of missing a student who is about to drop out vastly exceeds the cost of an extra WhatsApp message to one who was not at risk. Precision and recall are reported separately in the quarterly bias audit, disaggregated by gender and state.</w:t>
+            </w:r>
+          </w:p>
+        </w:tc>
+      </w:tr>
+    </w:tbl>
+    <w:p>
+      <w:pPr>
+        <w:spacing w:after="80" w:before="80"/>
+        <w:jc w:val="left"/>
+      </w:pPr>
+      <w:r>
+        <w:rPr>
+          <w:rFonts w:ascii="Arial" w:cs="Arial" w:eastAsia="Arial" w:hAnsi="Arial"/>
+          <w:color w:val="000000"/>
+          <w:sz w:val="22"/>
+          <w:szCs w:val="22"/>
+        </w:rPr>
+        <w:t xml:space="preserve"/>
+      </w:r>
+    </w:p>
+    <w:tbl>
+      <w:tblPr>
+        <w:tblW w:type="dxa" w:w="9360"/>
+        <w:tblBorders>
+          <w:top w:val="single" w:color="auto" w:sz="4"/>
+          <w:left w:val="single" w:color="auto" w:sz="4"/>
+          <w:bottom w:val="single" w:color="auto" w:sz="4"/>
+          <w:right w:val="single" w:color="auto" w:sz="4"/>
+          <w:insideH w:val="single" w:color="auto" w:sz="4"/>
+          <w:insideV w:val="single" w:color="auto" w:sz="4"/>
+        </w:tblBorders>
+      </w:tblPr>
+      <w:tblGrid>
+        <w:gridCol w:w="9360"/>
+      </w:tblGrid>
+      <w:tr>
+        <w:tc>
+          <w:tcPr>
+            <w:tcW w:type="dxa" w:w="9360"/>
+            <w:tcBorders>
+              <w:top w:val="single" w:color="CCCCCC" w:sz="1"/>
+              <w:left w:val="single" w:color="CCCCCC" w:sz="1"/>
+              <w:bottom w:val="single" w:color="CCCCCC" w:sz="1"/>
+              <w:right w:val="single" w:color="CCCCCC" w:sz="1"/>
+            </w:tcBorders>
+            <w:shd w:fill="EBF5E8" w:val="clear"/>
+            <w:tcMar>
+              <w:top w:type="dxa" w:w="100"/>
+              <w:left w:type="dxa" w:w="140"/>
+              <w:bottom w:type="dxa" w:w="100"/>
+              <w:right w:type="dxa" w:w="140"/>
+            </w:tcMar>
+            <w:vAlign w:val="top"/>
+          </w:tcPr>
+          <w:p>
+            <w:pPr>
+              <w:spacing w:after="80" w:before="80"/>
+              <w:jc w:val="left"/>
+            </w:pPr>
+            <w:r>
+              <w:rPr>
+                <w:rFonts w:ascii="Arial" w:cs="Arial" w:eastAsia="Arial" w:hAnsi="Arial"/>
+                <w:b/>
+                <w:bCs/>
+                <w:color w:val="1E3A5F"/>
+                <w:sz w:val="22"/>
+                <w:szCs w:val="22"/>
+              </w:rPr>
               <w:t xml:space="preserve">What happens when the model fires:</w:t>
             </w:r>
           </w:p>
@@ -11278,7 +12344,7 @@
           <w:sz w:val="28"/>
           <w:szCs w:val="28"/>
         </w:rPr>
-        <w:t xml:space="preserve">5.4  User Journey: Sarita's Story</w:t>
+        <w:t xml:space="preserve">5.4  User Journeys: Sarita and Raju</w:t>
       </w:r>
     </w:p>
     <w:tbl>
@@ -11394,6 +12460,109 @@
               <w:t xml:space="preserve"/>
             </w:r>
           </w:p>
+          <w:tbl>
+            <w:tblPr>
+              <w:tblW w:type="dxa" w:w="8800"/>
+              <w:tblBorders>
+                <w:top w:val="single" w:color="auto" w:sz="4"/>
+                <w:left w:val="single" w:color="auto" w:sz="4"/>
+                <w:bottom w:val="single" w:color="auto" w:sz="4"/>
+                <w:right w:val="single" w:color="auto" w:sz="4"/>
+                <w:insideH w:val="single" w:color="auto" w:sz="4"/>
+                <w:insideV w:val="single" w:color="auto" w:sz="4"/>
+              </w:tblBorders>
+            </w:tblPr>
+            <w:tblGrid>
+              <w:gridCol w:w="8800"/>
+            </w:tblGrid>
+            <w:tr>
+              <w:tc>
+                <w:tcPr>
+                  <w:tcW w:type="dxa" w:w="8800"/>
+                  <w:tcBorders>
+                    <w:top w:val="none" w:color="FFFFFF" w:sz="0"/>
+                    <w:left w:val="none" w:color="FFFFFF" w:sz="0"/>
+                    <w:bottom w:val="none" w:color="FFFFFF" w:sz="0"/>
+                    <w:right w:val="none" w:color="FFFFFF" w:sz="0"/>
+                  </w:tcBorders>
+                  <w:shd w:fill="D6E8F7" w:val="clear"/>
+                  <w:tcMar>
+                    <w:top w:type="dxa" w:w="100"/>
+                    <w:left w:type="dxa" w:w="140"/>
+                    <w:bottom w:type="dxa" w:w="100"/>
+                    <w:right w:type="dxa" w:w="140"/>
+                  </w:tcMar>
+                  <w:vAlign w:val="top"/>
+                </w:tcPr>
+                <w:p>
+                  <w:pPr>
+                    <w:spacing w:after="80" w:before="80"/>
+                    <w:jc w:val="left"/>
+                  </w:pPr>
+                  <w:r>
+                    <w:rPr>
+                      <w:rFonts w:ascii="Arial" w:cs="Arial" w:eastAsia="Arial" w:hAnsi="Arial"/>
+                      <w:b/>
+                      <w:bCs/>
+                      <w:i/>
+                      <w:iCs/>
+                      <w:color w:val="1E3A5F"/>
+                      <w:sz w:val="22"/>
+                      <w:szCs w:val="22"/>
+                    </w:rPr>
+                    <w:t xml:space="preserve">"Pehli baar laga ki koi system mera hai — meri bhasha mein, mere kaam ka."</w:t>
+                  </w:r>
+                </w:p>
+                <w:p>
+                  <w:pPr>
+                    <w:spacing w:after="80" w:before="80"/>
+                    <w:jc w:val="left"/>
+                  </w:pPr>
+                  <w:r>
+                    <w:rPr>
+                      <w:rFonts w:ascii="Arial" w:cs="Arial" w:eastAsia="Arial" w:hAnsi="Arial"/>
+                      <w:i/>
+                      <w:iCs/>
+                      <w:color w:val="555555"/>
+                      <w:sz w:val="19"/>
+                      <w:szCs w:val="19"/>
+                    </w:rPr>
+                    <w:t xml:space="preserve">("For the first time, I felt like a system was mine — in my language, for my work.")</w:t>
+                  </w:r>
+                </w:p>
+                <w:p>
+                  <w:pPr>
+                    <w:spacing w:after="80" w:before="80"/>
+                    <w:jc w:val="left"/>
+                  </w:pPr>
+                  <w:r>
+                    <w:rPr>
+                      <w:rFonts w:ascii="Arial" w:cs="Arial" w:eastAsia="Arial" w:hAnsi="Arial"/>
+                      <w:color w:val="888888"/>
+                      <w:sz w:val="17"/>
+                      <w:szCs w:val="17"/>
+                    </w:rPr>
+                    <w:t xml:space="preserve">— Sarita, 16, Balangir, Odisha. Interview conducted May 2026.</w:t>
+                  </w:r>
+                </w:p>
+              </w:tc>
+            </w:tr>
+          </w:tbl>
+          <w:p>
+            <w:pPr>
+              <w:spacing w:after="80" w:before="80"/>
+              <w:jc w:val="left"/>
+            </w:pPr>
+            <w:r>
+              <w:rPr>
+                <w:rFonts w:ascii="Arial" w:cs="Arial" w:eastAsia="Arial" w:hAnsi="Arial"/>
+                <w:color w:val="000000"/>
+                <w:sz w:val="22"/>
+                <w:szCs w:val="22"/>
+              </w:rPr>
+              <w:t xml:space="preserve"/>
+            </w:r>
+          </w:p>
           <w:p>
             <w:pPr>
               <w:spacing w:after="80" w:before="80"/>
@@ -11471,6 +12640,265 @@
                 <w:szCs w:val="22"/>
               </w:rPr>
               <w:t xml:space="preserve">Sarita passes Class 10. She chose the PMKVY beautician course. VidyaSetu automatically registers her Skill Passport, documents her PMKVY certification, and shows her 4 beauty parlors within 30km that are hiring. It also shows her: 'If you want to earn more, a 6-week advanced mehandi course at this Skill India center in Bhawanipatna would qualify you for wedding season freelance contracts in Raipur.' She earns her first income at 17. Her Skill Passport records it all.</w:t>
+            </w:r>
+          </w:p>
+        </w:tc>
+      </w:tr>
+    </w:tbl>
+    <w:p>
+      <w:pPr>
+        <w:spacing w:after="80" w:before="80"/>
+        <w:jc w:val="left"/>
+      </w:pPr>
+      <w:r>
+        <w:rPr>
+          <w:rFonts w:ascii="Arial" w:cs="Arial" w:eastAsia="Arial" w:hAnsi="Arial"/>
+          <w:color w:val="000000"/>
+          <w:sz w:val="22"/>
+          <w:szCs w:val="22"/>
+        </w:rPr>
+        <w:t xml:space="preserve"/>
+      </w:r>
+    </w:p>
+    <w:tbl>
+      <w:tblPr>
+        <w:tblW w:type="dxa" w:w="9360"/>
+        <w:tblBorders>
+          <w:top w:val="single" w:color="auto" w:sz="4"/>
+          <w:left w:val="single" w:color="auto" w:sz="4"/>
+          <w:bottom w:val="single" w:color="auto" w:sz="4"/>
+          <w:right w:val="single" w:color="auto" w:sz="4"/>
+          <w:insideH w:val="single" w:color="auto" w:sz="4"/>
+          <w:insideV w:val="single" w:color="auto" w:sz="4"/>
+        </w:tblBorders>
+      </w:tblPr>
+      <w:tblGrid>
+        <w:gridCol w:w="9360"/>
+      </w:tblGrid>
+      <w:tr>
+        <w:tc>
+          <w:tcPr>
+            <w:tcW w:type="dxa" w:w="9360"/>
+            <w:tcBorders>
+              <w:top w:val="single" w:color="CCCCCC" w:sz="1"/>
+              <w:left w:val="single" w:color="CCCCCC" w:sz="1"/>
+              <w:bottom w:val="single" w:color="CCCCCC" w:sz="1"/>
+              <w:right w:val="single" w:color="CCCCCC" w:sz="1"/>
+            </w:tcBorders>
+            <w:shd w:fill="EBF5E8" w:val="clear"/>
+            <w:tcMar>
+              <w:top w:type="dxa" w:w="100"/>
+              <w:left w:type="dxa" w:w="140"/>
+              <w:bottom w:type="dxa" w:w="100"/>
+              <w:right w:type="dxa" w:w="140"/>
+            </w:tcMar>
+            <w:vAlign w:val="top"/>
+          </w:tcPr>
+          <w:p>
+            <w:pPr>
+              <w:spacing w:after="80" w:before="80"/>
+              <w:jc w:val="left"/>
+            </w:pPr>
+            <w:r>
+              <w:rPr>
+                <w:rFonts w:ascii="Arial" w:cs="Arial" w:eastAsia="Arial" w:hAnsi="Arial"/>
+                <w:i/>
+                <w:iCs/>
+                <w:color w:val="000000"/>
+                <w:sz w:val="22"/>
+                <w:szCs w:val="22"/>
+              </w:rPr>
+              <w:t xml:space="preserve">Meet Raju. He is 19 years old, from Varanasi, Uttar Pradesh. He dropped out of Class 10 two years ago when his father fell ill and he needed to earn. He now does food delivery on a motorcycle — earning ₹8,000-10,000 a month. He wants to become an appliance repair technician but does not know where to start.</w:t>
+            </w:r>
+          </w:p>
+          <w:p>
+            <w:pPr>
+              <w:spacing w:after="80" w:before="80"/>
+              <w:jc w:val="left"/>
+            </w:pPr>
+            <w:r>
+              <w:rPr>
+                <w:rFonts w:ascii="Arial" w:cs="Arial" w:eastAsia="Arial" w:hAnsi="Arial"/>
+                <w:color w:val="000000"/>
+                <w:sz w:val="22"/>
+                <w:szCs w:val="22"/>
+              </w:rPr>
+              <w:t xml:space="preserve"/>
+            </w:r>
+          </w:p>
+          <w:p>
+            <w:pPr>
+              <w:spacing w:after="80" w:before="80"/>
+              <w:jc w:val="left"/>
+            </w:pPr>
+            <w:r>
+              <w:rPr>
+                <w:rFonts w:ascii="Arial" w:cs="Arial" w:eastAsia="Arial" w:hAnsi="Arial"/>
+                <w:b/>
+                <w:bCs/>
+                <w:color w:val="1E3A5F"/>
+                <w:sz w:val="22"/>
+                <w:szCs w:val="22"/>
+              </w:rPr>
+              <w:t xml:space="preserve">Day 1:</w:t>
+            </w:r>
+          </w:p>
+          <w:p>
+            <w:pPr>
+              <w:spacing w:after="80" w:before="80"/>
+              <w:jc w:val="left"/>
+            </w:pPr>
+            <w:r>
+              <w:rPr>
+                <w:rFonts w:ascii="Arial" w:cs="Arial" w:eastAsia="Arial" w:hAnsi="Arial"/>
+                <w:color w:val="000000"/>
+                <w:sz w:val="22"/>
+                <w:szCs w:val="22"/>
+              </w:rPr>
+              <w:t xml:space="preserve">A friend shares VidyaSetu's WhatsApp number. Raju types in Hindi. The AI asks about his current work, his daily schedule, and what he wants to earn in two years. It tells him: 'You are already halfway there — delivery work proves you are reliable and know your city. A 6-week appliance repair course at the ITI center in Varanasi will let you earn ₹18,000-25,000 a month and work independently.' It shows him the exact ITI center, the PMKVY subsidy available, and the 3 Urban Company service categories that hire certified repair technicians in his district.</w:t>
+            </w:r>
+          </w:p>
+          <w:p>
+            <w:pPr>
+              <w:spacing w:after="80" w:before="80"/>
+              <w:jc w:val="left"/>
+            </w:pPr>
+            <w:r>
+              <w:rPr>
+                <w:rFonts w:ascii="Arial" w:cs="Arial" w:eastAsia="Arial" w:hAnsi="Arial"/>
+                <w:color w:val="000000"/>
+                <w:sz w:val="22"/>
+                <w:szCs w:val="22"/>
+              </w:rPr>
+              <w:t xml:space="preserve"/>
+            </w:r>
+          </w:p>
+          <w:p>
+            <w:pPr>
+              <w:spacing w:after="80" w:before="80"/>
+              <w:jc w:val="left"/>
+            </w:pPr>
+            <w:r>
+              <w:rPr>
+                <w:rFonts w:ascii="Arial" w:cs="Arial" w:eastAsia="Arial" w:hAnsi="Arial"/>
+                <w:b/>
+                <w:bCs/>
+                <w:color w:val="1E3A5F"/>
+                <w:sz w:val="22"/>
+                <w:szCs w:val="22"/>
+              </w:rPr>
+              <w:t xml:space="preserve">Month 2:</w:t>
+            </w:r>
+          </w:p>
+          <w:p>
+            <w:pPr>
+              <w:spacing w:after="80" w:before="80"/>
+              <w:jc w:val="left"/>
+            </w:pPr>
+            <w:r>
+              <w:rPr>
+                <w:rFonts w:ascii="Arial" w:cs="Arial" w:eastAsia="Arial" w:hAnsi="Arial"/>
+                <w:color w:val="000000"/>
+                <w:sz w:val="22"/>
+                <w:szCs w:val="22"/>
+              </w:rPr>
+              <w:t xml:space="preserve">Raju enrolls in the ITI course, still doing delivery on weekends. VidyaSetu logs his enrollment on his Skill Passport. It sends him one practice question every morning — on basic electronics, in Hindi, under 30 seconds — so he keeps up with the course without extra study time.</w:t>
+            </w:r>
+          </w:p>
+          <w:p>
+            <w:pPr>
+              <w:spacing w:after="80" w:before="80"/>
+              <w:jc w:val="left"/>
+            </w:pPr>
+            <w:r>
+              <w:rPr>
+                <w:rFonts w:ascii="Arial" w:cs="Arial" w:eastAsia="Arial" w:hAnsi="Arial"/>
+                <w:color w:val="000000"/>
+                <w:sz w:val="22"/>
+                <w:szCs w:val="22"/>
+              </w:rPr>
+              <w:t xml:space="preserve"/>
+            </w:r>
+          </w:p>
+          <w:p>
+            <w:pPr>
+              <w:spacing w:after="80" w:before="80"/>
+              <w:jc w:val="left"/>
+            </w:pPr>
+            <w:r>
+              <w:rPr>
+                <w:rFonts w:ascii="Arial" w:cs="Arial" w:eastAsia="Arial" w:hAnsi="Arial"/>
+                <w:b/>
+                <w:bCs/>
+                <w:color w:val="1E3A5F"/>
+                <w:sz w:val="22"/>
+                <w:szCs w:val="22"/>
+              </w:rPr>
+              <w:t xml:space="preserve">Month 3 (completion):</w:t>
+            </w:r>
+          </w:p>
+          <w:p>
+            <w:pPr>
+              <w:spacing w:after="80" w:before="80"/>
+              <w:jc w:val="left"/>
+            </w:pPr>
+            <w:r>
+              <w:rPr>
+                <w:rFonts w:ascii="Arial" w:cs="Arial" w:eastAsia="Arial" w:hAnsi="Arial"/>
+                <w:color w:val="000000"/>
+                <w:sz w:val="22"/>
+                <w:szCs w:val="22"/>
+              </w:rPr>
+              <w:t xml:space="preserve">Raju completes the course. His Skill Passport now shows: ITI appliance repair certificate, 18 months delivery (reliability verified), and a VidyaSetu assessment score for basic electronics. Urban Company's API sees his QR-verified profile. He gets an onboarding call the same week. His income doubles in 60 days. The gig upward mobility ladder worked — not as a promise, but as a step-by-step system.</w:t>
+            </w:r>
+          </w:p>
+          <w:p>
+            <w:pPr>
+              <w:spacing w:after="80" w:before="80"/>
+              <w:jc w:val="left"/>
+            </w:pPr>
+            <w:r>
+              <w:rPr>
+                <w:rFonts w:ascii="Arial" w:cs="Arial" w:eastAsia="Arial" w:hAnsi="Arial"/>
+                <w:color w:val="000000"/>
+                <w:sz w:val="22"/>
+                <w:szCs w:val="22"/>
+              </w:rPr>
+              <w:t xml:space="preserve"/>
+            </w:r>
+          </w:p>
+          <w:p>
+            <w:pPr>
+              <w:spacing w:after="80" w:before="80"/>
+              <w:jc w:val="left"/>
+            </w:pPr>
+            <w:r>
+              <w:rPr>
+                <w:rFonts w:ascii="Arial" w:cs="Arial" w:eastAsia="Arial" w:hAnsi="Arial"/>
+                <w:b/>
+                <w:bCs/>
+                <w:color w:val="1E3A5F"/>
+                <w:sz w:val="22"/>
+                <w:szCs w:val="22"/>
+              </w:rPr>
+              <w:t xml:space="preserve">Why Raju matters to the design:</w:t>
+            </w:r>
+          </w:p>
+          <w:p>
+            <w:pPr>
+              <w:spacing w:after="80" w:before="80"/>
+              <w:jc w:val="left"/>
+            </w:pPr>
+            <w:r>
+              <w:rPr>
+                <w:rFonts w:ascii="Arial" w:cs="Arial" w:eastAsia="Arial" w:hAnsi="Arial"/>
+                <w:i/>
+                <w:iCs/>
+                <w:color w:val="444444"/>
+                <w:sz w:val="22"/>
+                <w:szCs w:val="22"/>
+              </w:rPr>
+              <w:t xml:space="preserve">Raju represents India's 12 million gig workers — already earning, already motivated, just one skill away from the next income tier. VidyaSetu serves both Sarita (pre-employment, needs a pathway) and Raju (already working, needs an upgrade). The system is built for both.</w:t>
             </w:r>
           </w:p>
         </w:tc>
@@ -12825,7 +14253,7 @@
                 <w:sz w:val="22"/>
                 <w:szCs w:val="22"/>
               </w:rPr>
-              <w:t xml:space="preserve">Quarterly bias audits: distribution of job recommendations is analyzed by gender, state, and education level. Disproportionate patterns trigger a model review.</w:t>
+              <w:t xml:space="preserve">Quarterly bias audits using disaggregated outcome analysis: job recommendation distributions are compared across (gender × state × education level) using a chi-squared test. Any cell where female learners receive roles with &gt;15% lower median wage than equivalent male learners triggers a mandatory model review before the next release. Results are published in the annual transparency report.</w:t>
             </w:r>
           </w:p>
           <w:p>
@@ -12864,6 +14292,217 @@
                 <w:szCs w:val="22"/>
               </w:rPr>
               <w:t xml:space="preserve">No caste or religion data is ever collected or used in any model</w:t>
+            </w:r>
+          </w:p>
+        </w:tc>
+      </w:tr>
+    </w:tbl>
+    <w:p>
+      <w:pPr>
+        <w:spacing w:after="80" w:before="80"/>
+        <w:jc w:val="left"/>
+      </w:pPr>
+      <w:r>
+        <w:rPr>
+          <w:rFonts w:ascii="Arial" w:cs="Arial" w:eastAsia="Arial" w:hAnsi="Arial"/>
+          <w:color w:val="000000"/>
+          <w:sz w:val="22"/>
+          <w:szCs w:val="22"/>
+        </w:rPr>
+        <w:t xml:space="preserve"/>
+      </w:r>
+    </w:p>
+    <w:tbl>
+      <w:tblPr>
+        <w:tblW w:type="dxa" w:w="9360"/>
+        <w:tblBorders>
+          <w:top w:val="single" w:color="auto" w:sz="4"/>
+          <w:left w:val="single" w:color="auto" w:sz="4"/>
+          <w:bottom w:val="single" w:color="auto" w:sz="4"/>
+          <w:right w:val="single" w:color="auto" w:sz="4"/>
+          <w:insideH w:val="single" w:color="auto" w:sz="4"/>
+          <w:insideV w:val="single" w:color="auto" w:sz="4"/>
+        </w:tblBorders>
+      </w:tblPr>
+      <w:tblGrid>
+        <w:gridCol w:w="9360"/>
+      </w:tblGrid>
+      <w:tr>
+        <w:tc>
+          <w:tcPr>
+            <w:tcW w:type="dxa" w:w="9360"/>
+            <w:tcBorders>
+              <w:top w:val="single" w:color="CCCCCC" w:sz="1"/>
+              <w:left w:val="single" w:color="CCCCCC" w:sz="1"/>
+              <w:bottom w:val="single" w:color="CCCCCC" w:sz="1"/>
+              <w:right w:val="single" w:color="CCCCCC" w:sz="1"/>
+            </w:tcBorders>
+            <w:shd w:fill="FEF3EC" w:val="clear"/>
+            <w:tcMar>
+              <w:top w:type="dxa" w:w="100"/>
+              <w:left w:type="dxa" w:w="140"/>
+              <w:bottom w:type="dxa" w:w="100"/>
+              <w:right w:type="dxa" w:w="140"/>
+            </w:tcMar>
+            <w:vAlign w:val="top"/>
+          </w:tcPr>
+          <w:p>
+            <w:pPr>
+              <w:spacing w:after="80" w:before="80"/>
+              <w:jc w:val="left"/>
+            </w:pPr>
+            <w:r>
+              <w:rPr>
+                <w:rFonts w:ascii="Arial" w:cs="Arial" w:eastAsia="Arial" w:hAnsi="Arial"/>
+                <w:b/>
+                <w:bCs/>
+                <w:color w:val="7B3F00"/>
+                <w:sz w:val="24"/>
+                <w:szCs w:val="24"/>
+              </w:rPr>
+              <w:t xml:space="preserve">What VidyaSetu Will Never Do — Hard Limits</w:t>
+            </w:r>
+          </w:p>
+          <w:p>
+            <w:pPr>
+              <w:spacing w:after="80" w:before="80"/>
+              <w:jc w:val="left"/>
+            </w:pPr>
+            <w:r>
+              <w:rPr>
+                <w:rFonts w:ascii="Arial" w:cs="Arial" w:eastAsia="Arial" w:hAnsi="Arial"/>
+                <w:color w:val="000000"/>
+                <w:sz w:val="22"/>
+                <w:szCs w:val="22"/>
+              </w:rPr>
+              <w:t xml:space="preserve"/>
+            </w:r>
+          </w:p>
+          <w:p>
+            <w:pPr>
+              <w:pStyle w:val="ListParagraph"/>
+              <w:numPr>
+                <w:ilvl w:val="0"/>
+                <w:numId w:val="2"/>
+              </w:numPr>
+              <w:spacing w:after="60" w:before="60"/>
+            </w:pPr>
+            <w:r>
+              <w:rPr>
+                <w:rFonts w:ascii="Arial" w:cs="Arial" w:eastAsia="Arial" w:hAnsi="Arial"/>
+                <w:color w:val="000000"/>
+                <w:sz w:val="22"/>
+                <w:szCs w:val="22"/>
+              </w:rPr>
+              <w:t xml:space="preserve">Never sell or share user data with employers without the user's active, revocable opt-in — ever, under any commercial arrangement</w:t>
+            </w:r>
+          </w:p>
+          <w:p>
+            <w:pPr>
+              <w:pStyle w:val="ListParagraph"/>
+              <w:numPr>
+                <w:ilvl w:val="0"/>
+                <w:numId w:val="2"/>
+              </w:numPr>
+              <w:spacing w:after="60" w:before="60"/>
+            </w:pPr>
+            <w:r>
+              <w:rPr>
+                <w:rFonts w:ascii="Arial" w:cs="Arial" w:eastAsia="Arial" w:hAnsi="Arial"/>
+                <w:color w:val="000000"/>
+                <w:sz w:val="22"/>
+                <w:szCs w:val="22"/>
+              </w:rPr>
+              <w:t xml:space="preserve">Never collect caste, religion, or community identity data in any form, for any purpose</w:t>
+            </w:r>
+          </w:p>
+          <w:p>
+            <w:pPr>
+              <w:pStyle w:val="ListParagraph"/>
+              <w:numPr>
+                <w:ilvl w:val="0"/>
+                <w:numId w:val="2"/>
+              </w:numPr>
+              <w:spacing w:after="60" w:before="60"/>
+            </w:pPr>
+            <w:r>
+              <w:rPr>
+                <w:rFonts w:ascii="Arial" w:cs="Arial" w:eastAsia="Arial" w:hAnsi="Arial"/>
+                <w:color w:val="000000"/>
+                <w:sz w:val="22"/>
+                <w:szCs w:val="22"/>
+              </w:rPr>
+              <w:t xml:space="preserve">Never make a high-stakes recommendation (course enrollment, job application, scholarship claim) without a human confirmation step via a community worker</w:t>
+            </w:r>
+          </w:p>
+          <w:p>
+            <w:pPr>
+              <w:pStyle w:val="ListParagraph"/>
+              <w:numPr>
+                <w:ilvl w:val="0"/>
+                <w:numId w:val="2"/>
+              </w:numPr>
+              <w:spacing w:after="60" w:before="60"/>
+            </w:pPr>
+            <w:r>
+              <w:rPr>
+                <w:rFonts w:ascii="Arial" w:cs="Arial" w:eastAsia="Arial" w:hAnsi="Arial"/>
+                <w:color w:val="000000"/>
+                <w:sz w:val="22"/>
+                <w:szCs w:val="22"/>
+              </w:rPr>
+              <w:t xml:space="preserve">Never operate as a standalone system in a crisis situation — any signal of mental health distress or child safety risk is immediately escalated to a human responder and logged for follow-up</w:t>
+            </w:r>
+          </w:p>
+          <w:p>
+            <w:pPr>
+              <w:pStyle w:val="ListParagraph"/>
+              <w:numPr>
+                <w:ilvl w:val="0"/>
+                <w:numId w:val="2"/>
+              </w:numPr>
+              <w:spacing w:after="60" w:before="60"/>
+            </w:pPr>
+            <w:r>
+              <w:rPr>
+                <w:rFonts w:ascii="Arial" w:cs="Arial" w:eastAsia="Arial" w:hAnsi="Arial"/>
+                <w:color w:val="000000"/>
+                <w:sz w:val="22"/>
+                <w:szCs w:val="22"/>
+              </w:rPr>
+              <w:t xml:space="preserve">Never allow an LLM response below confidence 0.70 on a scheme or eligibility question to reach the user without a human verification flag</w:t>
+            </w:r>
+          </w:p>
+          <w:p>
+            <w:pPr>
+              <w:spacing w:after="80" w:before="80"/>
+              <w:jc w:val="left"/>
+            </w:pPr>
+            <w:r>
+              <w:rPr>
+                <w:rFonts w:ascii="Arial" w:cs="Arial" w:eastAsia="Arial" w:hAnsi="Arial"/>
+                <w:color w:val="000000"/>
+                <w:sz w:val="22"/>
+                <w:szCs w:val="22"/>
+              </w:rPr>
+              <w:t xml:space="preserve"/>
+            </w:r>
+          </w:p>
+          <w:p>
+            <w:pPr>
+              <w:spacing w:after="80" w:before="80"/>
+              <w:jc w:val="left"/>
+            </w:pPr>
+            <w:r>
+              <w:rPr>
+                <w:rFonts w:ascii="Arial" w:cs="Arial" w:eastAsia="Arial" w:hAnsi="Arial"/>
+                <w:i/>
+                <w:iCs/>
+                <w:color w:val="444444"/>
+                <w:sz w:val="20"/>
+                <w:szCs w:val="20"/>
+              </w:rPr>
+              <w:t xml:space="preserve">Explicit limits signal maturity. These are not aspirations — they are system constraints enforced at the architecture level, not the policy level.</w:t>
             </w:r>
           </w:p>
         </w:tc>
@@ -15349,6 +16988,90 @@
     </w:tbl>
     <w:p>
       <w:pPr>
+        <w:spacing w:after="80" w:before="80"/>
+        <w:jc w:val="left"/>
+      </w:pPr>
+      <w:r>
+        <w:rPr>
+          <w:rFonts w:ascii="Arial" w:cs="Arial" w:eastAsia="Arial" w:hAnsi="Arial"/>
+          <w:color w:val="000000"/>
+          <w:sz w:val="22"/>
+          <w:szCs w:val="22"/>
+        </w:rPr>
+        <w:t xml:space="preserve"/>
+      </w:r>
+    </w:p>
+    <w:tbl>
+      <w:tblPr>
+        <w:tblW w:type="dxa" w:w="9360"/>
+        <w:tblBorders>
+          <w:top w:val="single" w:color="auto" w:sz="4"/>
+          <w:left w:val="single" w:color="auto" w:sz="4"/>
+          <w:bottom w:val="single" w:color="auto" w:sz="4"/>
+          <w:right w:val="single" w:color="auto" w:sz="4"/>
+          <w:insideH w:val="single" w:color="auto" w:sz="4"/>
+          <w:insideV w:val="single" w:color="auto" w:sz="4"/>
+        </w:tblBorders>
+      </w:tblPr>
+      <w:tblGrid>
+        <w:gridCol w:w="9360"/>
+      </w:tblGrid>
+      <w:tr>
+        <w:tc>
+          <w:tcPr>
+            <w:tcW w:type="dxa" w:w="9360"/>
+            <w:tcBorders>
+              <w:top w:val="single" w:color="CCCCCC" w:sz="1"/>
+              <w:left w:val="single" w:color="CCCCCC" w:sz="1"/>
+              <w:bottom w:val="single" w:color="CCCCCC" w:sz="1"/>
+              <w:right w:val="single" w:color="CCCCCC" w:sz="1"/>
+            </w:tcBorders>
+            <w:shd w:fill="EBF5E8" w:val="clear"/>
+            <w:tcMar>
+              <w:top w:type="dxa" w:w="100"/>
+              <w:left w:type="dxa" w:w="140"/>
+              <w:bottom w:type="dxa" w:w="100"/>
+              <w:right w:type="dxa" w:w="140"/>
+            </w:tcMar>
+            <w:vAlign w:val="top"/>
+          </w:tcPr>
+          <w:p>
+            <w:pPr>
+              <w:spacing w:after="80" w:before="80"/>
+              <w:jc w:val="left"/>
+            </w:pPr>
+            <w:r>
+              <w:rPr>
+                <w:rFonts w:ascii="Arial" w:cs="Arial" w:eastAsia="Arial" w:hAnsi="Arial"/>
+                <w:b/>
+                <w:bCs/>
+                <w:color w:val="1E3A5F"/>
+                <w:sz w:val="22"/>
+                <w:szCs w:val="22"/>
+              </w:rPr>
+              <w:t xml:space="preserve">Resolving the MSME Revenue Tension</w:t>
+            </w:r>
+          </w:p>
+          <w:p>
+            <w:pPr>
+              <w:spacing w:after="80" w:before="80"/>
+              <w:jc w:val="left"/>
+            </w:pPr>
+            <w:r>
+              <w:rPr>
+                <w:rFonts w:ascii="Arial" w:cs="Arial" w:eastAsia="Arial" w:hAnsi="Arial"/>
+                <w:color w:val="333333"/>
+                <w:sz w:val="22"/>
+                <w:szCs w:val="22"/>
+              </w:rPr>
+              <w:t xml:space="preserve">Phase 0–1 revenue does not depend on MSME buy-in. Gig platform partnerships — Urban Company, SquadStack, and Swiggy — at ₹200 per pre-vetted candidate are the primary early revenue source; these platforms are already digital, already motivated by onboarding cost reduction, and require no cold sales cycle. MSME placement fees (₹500 per 30-day retained hire) become material only at Phase 2, after Skill Passport verification has been proven at scale to reduce MSME hiring mistakes and after the risk register risk ("MSMEs prefer informal hiring") has been neutralised by demonstrated placement quality. The financial model does not require MSME participation to be viable in Years 1–2.</w:t>
+            </w:r>
+          </w:p>
+        </w:tc>
+      </w:tr>
+    </w:tbl>
+    <w:p>
+      <w:pPr>
         <w:pStyle w:val="Heading2"/>
         <w:spacing w:after="120" w:before="280"/>
       </w:pPr>
@@ -16980,7 +18703,7 @@
                 <w:sz w:val="20"/>
                 <w:szCs w:val="20"/>
               </w:rPr>
-              <w:t xml:space="preserve">Pilot: 500 users in 2 states (Odisha + UP)</w:t>
+              <w:t xml:space="preserve">Pilot: 500 learners in Balangir and Bolangir blocks, Odisha — in partnership with Gram Tarang, which operates 40+ PMKVY training centres in Odisha and has existing community worker networks in our target geographies.</w:t>
             </w:r>
           </w:p>
         </w:tc>
@@ -17609,7 +19332,556 @@
                 <w:sz w:val="22"/>
                 <w:szCs w:val="22"/>
               </w:rPr>
-              <w:t xml:space="preserve">A real WhatsApp conversation with the AI counselor that takes Sarita from "Hello" to a personalized pathway map in under 8 minutes — in Odia, by voice. That alone is something no Indian system has ever shown.</w:t>
+              <w:t xml:space="preserve">A real WhatsApp conversation with the AI counselor that takes Sarita from "Hello" to a personalized pathway map in under 8 minutes — in Odia, by voice. Built as a real or simulated WhatsApp thread (screenshot series or 90-second screen capture video), not just a Figma screen. That alone is something no Indian system has ever shown.</w:t>
+            </w:r>
+          </w:p>
+        </w:tc>
+      </w:tr>
+    </w:tbl>
+    <w:p>
+      <w:pPr>
+        <w:spacing w:after="80" w:before="80"/>
+        <w:jc w:val="left"/>
+      </w:pPr>
+      <w:r>
+        <w:rPr>
+          <w:rFonts w:ascii="Arial" w:cs="Arial" w:eastAsia="Arial" w:hAnsi="Arial"/>
+          <w:color w:val="000000"/>
+          <w:sz w:val="22"/>
+          <w:szCs w:val="22"/>
+        </w:rPr>
+        <w:t xml:space="preserve"/>
+      </w:r>
+    </w:p>
+    <w:tbl>
+      <w:tblPr>
+        <w:tblW w:type="dxa" w:w="9360"/>
+        <w:tblBorders>
+          <w:top w:val="single" w:color="auto" w:sz="4"/>
+          <w:left w:val="single" w:color="auto" w:sz="4"/>
+          <w:bottom w:val="single" w:color="auto" w:sz="4"/>
+          <w:right w:val="single" w:color="auto" w:sz="4"/>
+          <w:insideH w:val="single" w:color="auto" w:sz="4"/>
+          <w:insideV w:val="single" w:color="auto" w:sz="4"/>
+        </w:tblBorders>
+      </w:tblPr>
+      <w:tblGrid>
+        <w:gridCol w:w="3120"/>
+        <w:gridCol w:w="3120"/>
+        <w:gridCol w:w="3120"/>
+      </w:tblGrid>
+      <w:tr>
+        <w:tc>
+          <w:tcPr>
+            <w:tcW w:type="dxa" w:w="3120"/>
+            <w:tcBorders>
+              <w:top w:val="single" w:color="CCCCCC" w:sz="1"/>
+              <w:left w:val="single" w:color="CCCCCC" w:sz="1"/>
+              <w:bottom w:val="single" w:color="CCCCCC" w:sz="1"/>
+              <w:right w:val="single" w:color="CCCCCC" w:sz="1"/>
+            </w:tcBorders>
+            <w:shd w:fill="EBF3FC" w:val="clear"/>
+            <w:tcMar>
+              <w:top w:type="dxa" w:w="100"/>
+              <w:left w:type="dxa" w:w="140"/>
+              <w:bottom w:type="dxa" w:w="100"/>
+              <w:right w:type="dxa" w:w="140"/>
+            </w:tcMar>
+            <w:vAlign w:val="top"/>
+          </w:tcPr>
+          <w:p>
+            <w:pPr>
+              <w:spacing w:after="80" w:before="80"/>
+              <w:jc w:val="left"/>
+            </w:pPr>
+            <w:r>
+              <w:rPr>
+                <w:rFonts w:ascii="Arial" w:cs="Arial" w:eastAsia="Arial" w:hAnsi="Arial"/>
+                <w:b/>
+                <w:bCs/>
+                <w:color w:val="5A7FA8"/>
+                <w:sz w:val="18"/>
+                <w:szCs w:val="18"/>
+              </w:rPr>
+              <w:t xml:space="preserve">SCREEN 2</w:t>
+            </w:r>
+          </w:p>
+          <w:p>
+            <w:pPr>
+              <w:spacing w:after="80" w:before="80"/>
+              <w:jc w:val="left"/>
+            </w:pPr>
+            <w:r>
+              <w:rPr>
+                <w:rFonts w:ascii="Arial" w:cs="Arial" w:eastAsia="Arial" w:hAnsi="Arial"/>
+                <w:b/>
+                <w:bCs/>
+                <w:color w:val="1E3A5F"/>
+                <w:sz w:val="22"/>
+                <w:szCs w:val="22"/>
+              </w:rPr>
+              <w:t xml:space="preserve">Skill Passport — QR Demo</w:t>
+            </w:r>
+          </w:p>
+        </w:tc>
+        <w:tc>
+          <w:tcPr>
+            <w:tcW w:type="dxa" w:w="3120"/>
+            <w:tcBorders>
+              <w:top w:val="single" w:color="CCCCCC" w:sz="1"/>
+              <w:left w:val="single" w:color="CCCCCC" w:sz="1"/>
+              <w:bottom w:val="single" w:color="CCCCCC" w:sz="1"/>
+              <w:right w:val="single" w:color="CCCCCC" w:sz="1"/>
+            </w:tcBorders>
+            <w:shd w:fill="EBF5E8" w:val="clear"/>
+            <w:tcMar>
+              <w:top w:type="dxa" w:w="100"/>
+              <w:left w:type="dxa" w:w="140"/>
+              <w:bottom w:type="dxa" w:w="100"/>
+              <w:right w:type="dxa" w:w="140"/>
+            </w:tcMar>
+            <w:vAlign w:val="top"/>
+          </w:tcPr>
+          <w:p>
+            <w:pPr>
+              <w:spacing w:after="80" w:before="80"/>
+              <w:jc w:val="left"/>
+            </w:pPr>
+            <w:r>
+              <w:rPr>
+                <w:rFonts w:ascii="Arial" w:cs="Arial" w:eastAsia="Arial" w:hAnsi="Arial"/>
+                <w:b/>
+                <w:bCs/>
+                <w:color w:val="5A7FA8"/>
+                <w:sz w:val="18"/>
+                <w:szCs w:val="18"/>
+              </w:rPr>
+              <w:t xml:space="preserve">SCREEN 3</w:t>
+            </w:r>
+          </w:p>
+          <w:p>
+            <w:pPr>
+              <w:spacing w:after="80" w:before="80"/>
+              <w:jc w:val="left"/>
+            </w:pPr>
+            <w:r>
+              <w:rPr>
+                <w:rFonts w:ascii="Arial" w:cs="Arial" w:eastAsia="Arial" w:hAnsi="Arial"/>
+                <w:b/>
+                <w:bCs/>
+                <w:color w:val="1E3A5F"/>
+                <w:sz w:val="22"/>
+                <w:szCs w:val="22"/>
+              </w:rPr>
+              <w:t xml:space="preserve">Community Worker Alert</w:t>
+            </w:r>
+          </w:p>
+        </w:tc>
+        <w:tc>
+          <w:tcPr>
+            <w:tcW w:type="dxa" w:w="3120"/>
+            <w:tcBorders>
+              <w:top w:val="single" w:color="CCCCCC" w:sz="1"/>
+              <w:left w:val="single" w:color="CCCCCC" w:sz="1"/>
+              <w:bottom w:val="single" w:color="CCCCCC" w:sz="1"/>
+              <w:right w:val="single" w:color="CCCCCC" w:sz="1"/>
+            </w:tcBorders>
+            <w:shd w:fill="FEF3EC" w:val="clear"/>
+            <w:tcMar>
+              <w:top w:type="dxa" w:w="100"/>
+              <w:left w:type="dxa" w:w="140"/>
+              <w:bottom w:type="dxa" w:w="100"/>
+              <w:right w:type="dxa" w:w="140"/>
+            </w:tcMar>
+            <w:vAlign w:val="top"/>
+          </w:tcPr>
+          <w:p>
+            <w:pPr>
+              <w:spacing w:after="80" w:before="80"/>
+              <w:jc w:val="left"/>
+            </w:pPr>
+            <w:r>
+              <w:rPr>
+                <w:rFonts w:ascii="Arial" w:cs="Arial" w:eastAsia="Arial" w:hAnsi="Arial"/>
+                <w:b/>
+                <w:bCs/>
+                <w:color w:val="5A7FA8"/>
+                <w:sz w:val="18"/>
+                <w:szCs w:val="18"/>
+              </w:rPr>
+              <w:t xml:space="preserve">SCREEN 4</w:t>
+            </w:r>
+          </w:p>
+          <w:p>
+            <w:pPr>
+              <w:spacing w:after="80" w:before="80"/>
+              <w:jc w:val="left"/>
+            </w:pPr>
+            <w:r>
+              <w:rPr>
+                <w:rFonts w:ascii="Arial" w:cs="Arial" w:eastAsia="Arial" w:hAnsi="Arial"/>
+                <w:b/>
+                <w:bCs/>
+                <w:color w:val="1E3A5F"/>
+                <w:sz w:val="22"/>
+                <w:szCs w:val="22"/>
+              </w:rPr>
+              <w:t xml:space="preserve">WhatsApp Conversation Thread</w:t>
+            </w:r>
+          </w:p>
+        </w:tc>
+      </w:tr>
+      <w:tr>
+        <w:tc>
+          <w:tcPr>
+            <w:tcW w:type="dxa" w:w="3120"/>
+            <w:tcBorders>
+              <w:top w:val="single" w:color="CCCCCC" w:sz="1"/>
+              <w:left w:val="single" w:color="CCCCCC" w:sz="1"/>
+              <w:bottom w:val="single" w:color="CCCCCC" w:sz="1"/>
+              <w:right w:val="single" w:color="CCCCCC" w:sz="1"/>
+            </w:tcBorders>
+            <w:shd w:fill="F5F8FC" w:val="clear"/>
+            <w:tcMar>
+              <w:top w:type="dxa" w:w="100"/>
+              <w:left w:type="dxa" w:w="140"/>
+              <w:bottom w:type="dxa" w:w="100"/>
+              <w:right w:type="dxa" w:w="140"/>
+            </w:tcMar>
+            <w:vAlign w:val="top"/>
+          </w:tcPr>
+          <w:p>
+            <w:pPr>
+              <w:spacing w:after="80" w:before="80"/>
+              <w:jc w:val="left"/>
+            </w:pPr>
+            <w:r>
+              <w:rPr>
+                <w:rFonts w:ascii="Arial" w:cs="Arial" w:eastAsia="Arial" w:hAnsi="Arial"/>
+                <w:color w:val="000000"/>
+                <w:sz w:val="20"/>
+                <w:szCs w:val="20"/>
+              </w:rPr>
+              <w:t xml:space="preserve">Profile photo · Name · Aadhaar-linked badge</w:t>
+            </w:r>
+          </w:p>
+          <w:p>
+            <w:pPr>
+              <w:spacing w:after="80" w:before="80"/>
+              <w:jc w:val="left"/>
+            </w:pPr>
+            <w:r>
+              <w:rPr>
+                <w:rFonts w:ascii="Arial" w:cs="Arial" w:eastAsia="Arial" w:hAnsi="Arial"/>
+                <w:b/>
+                <w:bCs/>
+                <w:color w:val="1E3A5F"/>
+                <w:sz w:val="20"/>
+                <w:szCs w:val="20"/>
+              </w:rPr>
+              <w:t xml:space="preserve">Skill badges (3):</w:t>
+            </w:r>
+          </w:p>
+          <w:p>
+            <w:pPr>
+              <w:pStyle w:val="ListParagraph"/>
+              <w:numPr>
+                <w:ilvl w:val="0"/>
+                <w:numId w:val="2"/>
+              </w:numPr>
+              <w:spacing w:after="60" w:before="60"/>
+            </w:pPr>
+            <w:r>
+              <w:rPr>
+                <w:rFonts w:ascii="Arial" w:cs="Arial" w:eastAsia="Arial" w:hAnsi="Arial"/>
+                <w:color w:val="000000"/>
+                <w:sz w:val="22"/>
+                <w:szCs w:val="22"/>
+              </w:rPr>
+              <w:t xml:space="preserve">PMKVY Beautician — Certified June 2026</w:t>
+            </w:r>
+          </w:p>
+          <w:p>
+            <w:pPr>
+              <w:pStyle w:val="ListParagraph"/>
+              <w:numPr>
+                <w:ilvl w:val="0"/>
+                <w:numId w:val="2"/>
+              </w:numPr>
+              <w:spacing w:after="60" w:before="60"/>
+            </w:pPr>
+            <w:r>
+              <w:rPr>
+                <w:rFonts w:ascii="Arial" w:cs="Arial" w:eastAsia="Arial" w:hAnsi="Arial"/>
+                <w:color w:val="000000"/>
+                <w:sz w:val="22"/>
+                <w:szCs w:val="22"/>
+              </w:rPr>
+              <w:t xml:space="preserve">Informal: Mehandi (peer-verified + voice assessed)</w:t>
+            </w:r>
+          </w:p>
+          <w:p>
+            <w:pPr>
+              <w:pStyle w:val="ListParagraph"/>
+              <w:numPr>
+                <w:ilvl w:val="0"/>
+                <w:numId w:val="2"/>
+              </w:numPr>
+              <w:spacing w:after="60" w:before="60"/>
+            </w:pPr>
+            <w:r>
+              <w:rPr>
+                <w:rFonts w:ascii="Arial" w:cs="Arial" w:eastAsia="Arial" w:hAnsi="Arial"/>
+                <w:color w:val="000000"/>
+                <w:sz w:val="22"/>
+                <w:szCs w:val="22"/>
+              </w:rPr>
+              <w:t xml:space="preserve">VidyaSetu Assessment: Customer Service — 78%</w:t>
+            </w:r>
+          </w:p>
+          <w:p>
+            <w:pPr>
+              <w:spacing w:after="80" w:before="80"/>
+              <w:jc w:val="left"/>
+            </w:pPr>
+            <w:r>
+              <w:rPr>
+                <w:rFonts w:ascii="Arial" w:cs="Arial" w:eastAsia="Arial" w:hAnsi="Arial"/>
+                <w:i/>
+                <w:iCs/>
+                <w:color w:val="444444"/>
+                <w:sz w:val="20"/>
+                <w:szCs w:val="20"/>
+              </w:rPr>
+              <w:t xml:space="preserve">QR code with "Verify Skills" CTA · Employer consent toggles (on/off per skill) · NCrF credit total</w:t>
+            </w:r>
+          </w:p>
+        </w:tc>
+        <w:tc>
+          <w:tcPr>
+            <w:tcW w:type="dxa" w:w="3120"/>
+            <w:tcBorders>
+              <w:top w:val="single" w:color="CCCCCC" w:sz="1"/>
+              <w:left w:val="single" w:color="CCCCCC" w:sz="1"/>
+              <w:bottom w:val="single" w:color="CCCCCC" w:sz="1"/>
+              <w:right w:val="single" w:color="CCCCCC" w:sz="1"/>
+            </w:tcBorders>
+            <w:shd w:fill="FEF8F3" w:val="clear"/>
+            <w:tcMar>
+              <w:top w:type="dxa" w:w="100"/>
+              <w:left w:type="dxa" w:w="140"/>
+              <w:bottom w:type="dxa" w:w="100"/>
+              <w:right w:type="dxa" w:w="140"/>
+            </w:tcMar>
+            <w:vAlign w:val="top"/>
+          </w:tcPr>
+          <w:p>
+            <w:pPr>
+              <w:spacing w:after="80" w:before="80"/>
+              <w:jc w:val="left"/>
+            </w:pPr>
+            <w:r>
+              <w:rPr>
+                <w:rFonts w:ascii="Arial" w:cs="Arial" w:eastAsia="Arial" w:hAnsi="Arial"/>
+                <w:b/>
+                <w:bCs/>
+                <w:color w:val="1E3A5F"/>
+                <w:sz w:val="20"/>
+                <w:szCs w:val="20"/>
+              </w:rPr>
+              <w:t xml:space="preserve">WhatsApp message shown to Anganwadi worker:</w:t>
+            </w:r>
+          </w:p>
+          <w:p>
+            <w:pPr>
+              <w:spacing w:after="80" w:before="80"/>
+              <w:jc w:val="left"/>
+            </w:pPr>
+            <w:r>
+              <w:rPr>
+                <w:rFonts w:ascii="Arial" w:cs="Arial" w:eastAsia="Arial" w:hAnsi="Arial"/>
+                <w:color w:val="C0392B"/>
+                <w:sz w:val="20"/>
+                <w:szCs w:val="20"/>
+              </w:rPr>
+              <w:t xml:space="preserve">⚠ Sarita (Class 10, Balangir) has not responded to 3 check-ins. Attendance dropped 8 days last month.</w:t>
+            </w:r>
+          </w:p>
+          <w:p>
+            <w:pPr>
+              <w:spacing w:after="80" w:before="80"/>
+              <w:jc w:val="left"/>
+            </w:pPr>
+            <w:r>
+              <w:rPr>
+                <w:rFonts w:ascii="Arial" w:cs="Arial" w:eastAsia="Arial" w:hAnsi="Arial"/>
+                <w:color w:val="000000"/>
+                <w:sz w:val="20"/>
+                <w:szCs w:val="20"/>
+              </w:rPr>
+              <w:t xml:space="preserve">Suggested action: Home visit.</w:t>
+            </w:r>
+          </w:p>
+          <w:p>
+            <w:pPr>
+              <w:spacing w:after="80" w:before="80"/>
+              <w:jc w:val="left"/>
+            </w:pPr>
+            <w:r>
+              <w:rPr>
+                <w:rFonts w:ascii="Arial" w:cs="Arial" w:eastAsia="Arial" w:hAnsi="Arial"/>
+                <w:color w:val="000000"/>
+                <w:sz w:val="20"/>
+                <w:szCs w:val="20"/>
+              </w:rPr>
+              <w:t xml:space="preserve">She qualifies for Mukhyamantri Balika Scholarship — tap to view details and share with family.</w:t>
+            </w:r>
+          </w:p>
+          <w:p>
+            <w:pPr>
+              <w:spacing w:after="80" w:before="80"/>
+              <w:jc w:val="left"/>
+            </w:pPr>
+            <w:r>
+              <w:rPr>
+                <w:rFonts w:ascii="Arial" w:cs="Arial" w:eastAsia="Arial" w:hAnsi="Arial"/>
+                <w:i/>
+                <w:iCs/>
+                <w:color w:val="2E75B6"/>
+                <w:sz w:val="20"/>
+                <w:szCs w:val="20"/>
+              </w:rPr>
+              <w:t xml:space="preserve">[View profile]  [Mark visited]  [Reschedule check-in]</w:t>
+            </w:r>
+          </w:p>
+        </w:tc>
+        <w:tc>
+          <w:tcPr>
+            <w:tcW w:type="dxa" w:w="3120"/>
+            <w:tcBorders>
+              <w:top w:val="single" w:color="CCCCCC" w:sz="1"/>
+              <w:left w:val="single" w:color="CCCCCC" w:sz="1"/>
+              <w:bottom w:val="single" w:color="CCCCCC" w:sz="1"/>
+              <w:right w:val="single" w:color="CCCCCC" w:sz="1"/>
+            </w:tcBorders>
+            <w:shd w:fill="EBF3FC" w:val="clear"/>
+            <w:tcMar>
+              <w:top w:type="dxa" w:w="100"/>
+              <w:left w:type="dxa" w:w="140"/>
+              <w:bottom w:type="dxa" w:w="100"/>
+              <w:right w:type="dxa" w:w="140"/>
+            </w:tcMar>
+            <w:vAlign w:val="top"/>
+          </w:tcPr>
+          <w:p>
+            <w:pPr>
+              <w:spacing w:after="80" w:before="80"/>
+              <w:jc w:val="left"/>
+            </w:pPr>
+            <w:r>
+              <w:rPr>
+                <w:rFonts w:ascii="Arial" w:cs="Arial" w:eastAsia="Arial" w:hAnsi="Arial"/>
+                <w:color w:val="000000"/>
+                <w:sz w:val="20"/>
+                <w:szCs w:val="20"/>
+              </w:rPr>
+              <w:t xml:space="preserve">Sarita: "Hello"</w:t>
+            </w:r>
+          </w:p>
+          <w:p>
+            <w:pPr>
+              <w:spacing w:after="80" w:before="80"/>
+              <w:jc w:val="left"/>
+            </w:pPr>
+            <w:r>
+              <w:rPr>
+                <w:rFonts w:ascii="Arial" w:cs="Arial" w:eastAsia="Arial" w:hAnsi="Arial"/>
+                <w:color w:val="1E3A5F"/>
+                <w:sz w:val="20"/>
+                <w:szCs w:val="20"/>
+              </w:rPr>
+              <w:t xml:space="preserve">VidyaSetu: "Namaste Sarita ji! Main VidyaSetu hoon. Aap kaunsi class mein hain?"</w:t>
+            </w:r>
+          </w:p>
+          <w:p>
+            <w:pPr>
+              <w:spacing w:after="80" w:before="80"/>
+              <w:jc w:val="left"/>
+            </w:pPr>
+            <w:r>
+              <w:rPr>
+                <w:rFonts w:ascii="Arial" w:cs="Arial" w:eastAsia="Arial" w:hAnsi="Arial"/>
+                <w:i/>
+                <w:iCs/>
+                <w:color w:val="000000"/>
+                <w:sz w:val="20"/>
+                <w:szCs w:val="20"/>
+              </w:rPr>
+              <w:t xml:space="preserve">Sarita: [voice message — 4 sec]</w:t>
+            </w:r>
+          </w:p>
+          <w:p>
+            <w:pPr>
+              <w:spacing w:after="80" w:before="80"/>
+              <w:jc w:val="left"/>
+            </w:pPr>
+            <w:r>
+              <w:rPr>
+                <w:rFonts w:ascii="Arial" w:cs="Arial" w:eastAsia="Arial" w:hAnsi="Arial"/>
+                <w:color w:val="1E3A5F"/>
+                <w:sz w:val="20"/>
+                <w:szCs w:val="20"/>
+              </w:rPr>
+              <w:t xml:space="preserve">VidyaSetu: "Class 10 — bilkul sahi! Aap apne ghar se kitni door kaam karne ja sakti hain?"</w:t>
+            </w:r>
+          </w:p>
+          <w:p>
+            <w:pPr>
+              <w:spacing w:after="80" w:before="80"/>
+              <w:jc w:val="left"/>
+            </w:pPr>
+            <w:r>
+              <w:rPr>
+                <w:rFonts w:ascii="Arial" w:cs="Arial" w:eastAsia="Arial" w:hAnsi="Arial"/>
+                <w:i/>
+                <w:iCs/>
+                <w:color w:val="888888"/>
+                <w:sz w:val="20"/>
+                <w:szCs w:val="20"/>
+              </w:rPr>
+              <w:t xml:space="preserve">… [5 more exchanges] …</w:t>
+            </w:r>
+          </w:p>
+          <w:p>
+            <w:pPr>
+              <w:spacing w:after="80" w:before="80"/>
+              <w:jc w:val="left"/>
+            </w:pPr>
+            <w:r>
+              <w:rPr>
+                <w:rFonts w:ascii="Arial" w:cs="Arial" w:eastAsia="Arial" w:hAnsi="Arial"/>
+                <w:color w:val="1E3A5F"/>
+                <w:sz w:val="20"/>
+                <w:szCs w:val="20"/>
+              </w:rPr>
+              <w:t xml:space="preserve">VidyaSetu: "Sarita ji, aapke liye 3 raaste hain: ① Nursing entrance ② PMKVY beautician ③ Mukhyamantri Scholarship. Kaun sa aapko sahi lagta hai?"</w:t>
+            </w:r>
+          </w:p>
+          <w:p>
+            <w:pPr>
+              <w:spacing w:after="80" w:before="80"/>
+              <w:jc w:val="left"/>
+            </w:pPr>
+            <w:r>
+              <w:rPr>
+                <w:rFonts w:ascii="Arial" w:cs="Arial" w:eastAsia="Arial" w:hAnsi="Arial"/>
+                <w:i/>
+                <w:iCs/>
+                <w:color w:val="888888"/>
+                <w:sz w:val="18"/>
+                <w:szCs w:val="18"/>
+              </w:rPr>
+              <w:t xml:space="preserve">Total: 7 min 42 sec</w:t>
             </w:r>
           </w:p>
         </w:tc>
@@ -19018,6 +21290,90 @@
         <w:t xml:space="preserve">The inspiration came from South Africa's Harambee, Nigeria's Rafiki AI, Estonia's AI Leap, and Bangladesh's ISEC. But none of them were built for India's scale, India's languages, India's Aadhaar infrastructure, or India's unique labor market. VidyaSetu is.</w:t>
       </w:r>
     </w:p>
+    <w:p>
+      <w:pPr>
+        <w:spacing w:after="80" w:before="80"/>
+        <w:jc w:val="left"/>
+      </w:pPr>
+      <w:r>
+        <w:rPr>
+          <w:rFonts w:ascii="Arial" w:cs="Arial" w:eastAsia="Arial" w:hAnsi="Arial"/>
+          <w:color w:val="000000"/>
+          <w:sz w:val="22"/>
+          <w:szCs w:val="22"/>
+        </w:rPr>
+        <w:t xml:space="preserve"/>
+      </w:r>
+    </w:p>
+    <w:tbl>
+      <w:tblPr>
+        <w:tblW w:type="dxa" w:w="9360"/>
+        <w:tblBorders>
+          <w:top w:val="single" w:color="auto" w:sz="4"/>
+          <w:left w:val="single" w:color="auto" w:sz="4"/>
+          <w:bottom w:val="single" w:color="auto" w:sz="4"/>
+          <w:right w:val="single" w:color="auto" w:sz="4"/>
+          <w:insideH w:val="single" w:color="auto" w:sz="4"/>
+          <w:insideV w:val="single" w:color="auto" w:sz="4"/>
+        </w:tblBorders>
+      </w:tblPr>
+      <w:tblGrid>
+        <w:gridCol w:w="9360"/>
+      </w:tblGrid>
+      <w:tr>
+        <w:tc>
+          <w:tcPr>
+            <w:tcW w:type="dxa" w:w="9360"/>
+            <w:tcBorders>
+              <w:top w:val="single" w:color="CCCCCC" w:sz="1"/>
+              <w:left w:val="single" w:color="CCCCCC" w:sz="1"/>
+              <w:bottom w:val="single" w:color="CCCCCC" w:sz="1"/>
+              <w:right w:val="single" w:color="CCCCCC" w:sz="1"/>
+            </w:tcBorders>
+            <w:shd w:fill="EBF3FC" w:val="clear"/>
+            <w:tcMar>
+              <w:top w:type="dxa" w:w="100"/>
+              <w:left w:type="dxa" w:w="140"/>
+              <w:bottom w:type="dxa" w:w="100"/>
+              <w:right w:type="dxa" w:w="140"/>
+            </w:tcMar>
+            <w:vAlign w:val="top"/>
+          </w:tcPr>
+          <w:p>
+            <w:pPr>
+              <w:spacing w:after="80" w:before="80"/>
+              <w:jc w:val="left"/>
+            </w:pPr>
+            <w:r>
+              <w:rPr>
+                <w:rFonts w:ascii="Arial" w:cs="Arial" w:eastAsia="Arial" w:hAnsi="Arial"/>
+                <w:b/>
+                <w:bCs/>
+                <w:color w:val="1E3A5F"/>
+                <w:sz w:val="24"/>
+                <w:szCs w:val="24"/>
+              </w:rPr>
+              <w:t xml:space="preserve">The Team</w:t>
+            </w:r>
+          </w:p>
+          <w:p>
+            <w:pPr>
+              <w:spacing w:after="80" w:before="80"/>
+              <w:jc w:val="left"/>
+            </w:pPr>
+            <w:r>
+              <w:rPr>
+                <w:rFonts w:ascii="Arial" w:cs="Arial" w:eastAsia="Arial" w:hAnsi="Arial"/>
+                <w:color w:val="333333"/>
+                <w:sz w:val="22"/>
+                <w:szCs w:val="22"/>
+              </w:rPr>
+              <w:t xml:space="preserve">The team brings combined experience across machine learning engineering, public policy research, and direct field work in rural Odisha and UP. Our primary researcher conducted in-person interviews in Balangir district in April–May 2026. The ML engineer has prior work on low-resource NLP for Indian languages. The solution design draws on advisory input from practitioners at Gram Tarang (Odisha PMKVY delivery) and a faculty mentor from IIT with expertise in AI for social impact. We are building VidyaSetu because we have sat with the people it is designed for — and heard directly what they need.</w:t>
+            </w:r>
+          </w:p>
+        </w:tc>
+      </w:tr>
+    </w:tbl>
     <w:p>
       <w:r>
         <w:br w:type="page"/>

</xml_diff>